<commit_message>
added div for about page as per requiredd
</commit_message>
<xml_diff>
--- a/Doccuments/Proposal 1.docx
+++ b/Doccuments/Proposal 1.docx
@@ -261,7 +261,7 @@
               <w:noProof/>
               <w:sz w:val="24"/>
               <w:szCs w:val="24"/>
-              <w:lang w:eastAsia="en-ZA"/>
+              <w:lang w:val="en-US"/>
             </w:rPr>
           </w:pPr>
           <w:r>
@@ -273,7 +273,7 @@
           <w:r>
             <w:fldChar w:fldCharType="separate"/>
           </w:r>
-          <w:hyperlink w:anchor="_Toc230827100" w:history="1">
+          <w:hyperlink w:anchor="_Toc230942996" w:history="1">
             <w:r>
               <w:rPr>
                 <w:rStyle w:val="Hyperlink"/>
@@ -300,7 +300,7 @@
                 <w:noProof/>
                 <w:webHidden/>
               </w:rPr>
-              <w:instrText xml:space="preserve"> PAGEREF _Toc230827100 \h </w:instrText>
+              <w:instrText xml:space="preserve"> PAGEREF _Toc230942996 \h </w:instrText>
             </w:r>
             <w:r>
               <w:rPr>
@@ -342,10 +342,10 @@
               <w:noProof/>
               <w:sz w:val="24"/>
               <w:szCs w:val="24"/>
-              <w:lang w:eastAsia="en-ZA"/>
+              <w:lang w:val="en-US"/>
             </w:rPr>
           </w:pPr>
-          <w:hyperlink w:anchor="_Toc230827101" w:history="1">
+          <w:hyperlink w:anchor="_Toc230942997" w:history="1">
             <w:r>
               <w:rPr>
                 <w:rStyle w:val="Hyperlink"/>
@@ -372,7 +372,7 @@
                 <w:noProof/>
                 <w:webHidden/>
               </w:rPr>
-              <w:instrText xml:space="preserve"> PAGEREF _Toc230827101 \h </w:instrText>
+              <w:instrText xml:space="preserve"> PAGEREF _Toc230942997 \h </w:instrText>
             </w:r>
             <w:r>
               <w:rPr>
@@ -414,10 +414,10 @@
               <w:noProof/>
               <w:sz w:val="24"/>
               <w:szCs w:val="24"/>
-              <w:lang w:eastAsia="en-ZA"/>
+              <w:lang w:val="en-US"/>
             </w:rPr>
           </w:pPr>
-          <w:hyperlink w:anchor="_Toc230827102" w:history="1">
+          <w:hyperlink w:anchor="_Toc230942998" w:history="1">
             <w:r>
               <w:rPr>
                 <w:rStyle w:val="Hyperlink"/>
@@ -444,7 +444,7 @@
                 <w:noProof/>
                 <w:webHidden/>
               </w:rPr>
-              <w:instrText xml:space="preserve"> PAGEREF _Toc230827102 \h </w:instrText>
+              <w:instrText xml:space="preserve"> PAGEREF _Toc230942998 \h </w:instrText>
             </w:r>
             <w:r>
               <w:rPr>
@@ -486,10 +486,10 @@
               <w:noProof/>
               <w:sz w:val="24"/>
               <w:szCs w:val="24"/>
-              <w:lang w:eastAsia="en-ZA"/>
+              <w:lang w:val="en-US"/>
             </w:rPr>
           </w:pPr>
-          <w:hyperlink w:anchor="_Toc230827103" w:history="1">
+          <w:hyperlink w:anchor="_Toc230942999" w:history="1">
             <w:r>
               <w:rPr>
                 <w:rStyle w:val="Hyperlink"/>
@@ -516,7 +516,7 @@
                 <w:noProof/>
                 <w:webHidden/>
               </w:rPr>
-              <w:instrText xml:space="preserve"> PAGEREF _Toc230827103 \h </w:instrText>
+              <w:instrText xml:space="preserve"> PAGEREF _Toc230942999 \h </w:instrText>
             </w:r>
             <w:r>
               <w:rPr>
@@ -554,10 +554,14 @@
               <w:tab w:val="right" w:leader="dot" w:pos="9350"/>
             </w:tabs>
             <w:rPr>
+              <w:rFonts w:eastAsiaTheme="minorEastAsia"/>
               <w:noProof/>
+              <w:sz w:val="24"/>
+              <w:szCs w:val="24"/>
+              <w:lang w:val="en-US"/>
             </w:rPr>
           </w:pPr>
-          <w:hyperlink w:anchor="_Toc230827104" w:history="1">
+          <w:hyperlink w:anchor="_Toc230943000" w:history="1">
             <w:r>
               <w:rPr>
                 <w:rStyle w:val="Hyperlink"/>
@@ -584,7 +588,7 @@
                 <w:noProof/>
                 <w:webHidden/>
               </w:rPr>
-              <w:instrText xml:space="preserve"> PAGEREF _Toc230827104 \h </w:instrText>
+              <w:instrText xml:space="preserve"> PAGEREF _Toc230943000 \h </w:instrText>
             </w:r>
             <w:r>
               <w:rPr>
@@ -622,10 +626,14 @@
               <w:tab w:val="right" w:leader="dot" w:pos="9350"/>
             </w:tabs>
             <w:rPr>
+              <w:rFonts w:eastAsiaTheme="minorEastAsia"/>
               <w:noProof/>
+              <w:sz w:val="24"/>
+              <w:szCs w:val="24"/>
+              <w:lang w:val="en-US"/>
             </w:rPr>
           </w:pPr>
-          <w:hyperlink w:anchor="_Toc230827105" w:history="1">
+          <w:hyperlink w:anchor="_Toc230943001" w:history="1">
             <w:r>
               <w:rPr>
                 <w:rStyle w:val="Hyperlink"/>
@@ -652,7 +660,7 @@
                 <w:noProof/>
                 <w:webHidden/>
               </w:rPr>
-              <w:instrText xml:space="preserve"> PAGEREF _Toc230827105 \h </w:instrText>
+              <w:instrText xml:space="preserve"> PAGEREF _Toc230943001 \h </w:instrText>
             </w:r>
             <w:r>
               <w:rPr>
@@ -690,10 +698,14 @@
               <w:tab w:val="right" w:leader="dot" w:pos="9350"/>
             </w:tabs>
             <w:rPr>
+              <w:rFonts w:eastAsiaTheme="minorEastAsia"/>
               <w:noProof/>
+              <w:sz w:val="24"/>
+              <w:szCs w:val="24"/>
+              <w:lang w:val="en-US"/>
             </w:rPr>
           </w:pPr>
-          <w:hyperlink w:anchor="_Toc230827106" w:history="1">
+          <w:hyperlink w:anchor="_Toc230943002" w:history="1">
             <w:r>
               <w:rPr>
                 <w:rStyle w:val="Hyperlink"/>
@@ -720,7 +732,7 @@
                 <w:noProof/>
                 <w:webHidden/>
               </w:rPr>
-              <w:instrText xml:space="preserve"> PAGEREF _Toc230827106 \h </w:instrText>
+              <w:instrText xml:space="preserve"> PAGEREF _Toc230943002 \h </w:instrText>
             </w:r>
             <w:r>
               <w:rPr>
@@ -758,10 +770,14 @@
               <w:tab w:val="right" w:leader="dot" w:pos="9350"/>
             </w:tabs>
             <w:rPr>
+              <w:rFonts w:eastAsiaTheme="minorEastAsia"/>
               <w:noProof/>
+              <w:sz w:val="24"/>
+              <w:szCs w:val="24"/>
+              <w:lang w:val="en-US"/>
             </w:rPr>
           </w:pPr>
-          <w:hyperlink w:anchor="_Toc230827107" w:history="1">
+          <w:hyperlink w:anchor="_Toc230943003" w:history="1">
             <w:r>
               <w:rPr>
                 <w:rStyle w:val="Hyperlink"/>
@@ -788,7 +804,7 @@
                 <w:noProof/>
                 <w:webHidden/>
               </w:rPr>
-              <w:instrText xml:space="preserve"> PAGEREF _Toc230827107 \h </w:instrText>
+              <w:instrText xml:space="preserve"> PAGEREF _Toc230943003 \h </w:instrText>
             </w:r>
             <w:r>
               <w:rPr>
@@ -826,10 +842,14 @@
               <w:tab w:val="right" w:leader="dot" w:pos="9350"/>
             </w:tabs>
             <w:rPr>
+              <w:rFonts w:eastAsiaTheme="minorEastAsia"/>
               <w:noProof/>
+              <w:sz w:val="24"/>
+              <w:szCs w:val="24"/>
+              <w:lang w:val="en-US"/>
             </w:rPr>
           </w:pPr>
-          <w:hyperlink w:anchor="_Toc230827108" w:history="1">
+          <w:hyperlink w:anchor="_Toc230943004" w:history="1">
             <w:r>
               <w:rPr>
                 <w:rStyle w:val="Hyperlink"/>
@@ -856,7 +876,7 @@
                 <w:noProof/>
                 <w:webHidden/>
               </w:rPr>
-              <w:instrText xml:space="preserve"> PAGEREF _Toc230827108 \h </w:instrText>
+              <w:instrText xml:space="preserve"> PAGEREF _Toc230943004 \h </w:instrText>
             </w:r>
             <w:r>
               <w:rPr>
@@ -898,10 +918,10 @@
               <w:noProof/>
               <w:sz w:val="24"/>
               <w:szCs w:val="24"/>
-              <w:lang w:eastAsia="en-ZA"/>
+              <w:lang w:val="en-US"/>
             </w:rPr>
           </w:pPr>
-          <w:hyperlink w:anchor="_Toc230827109" w:history="1">
+          <w:hyperlink w:anchor="_Toc230943005" w:history="1">
             <w:r>
               <w:rPr>
                 <w:rStyle w:val="Hyperlink"/>
@@ -928,7 +948,7 @@
                 <w:noProof/>
                 <w:webHidden/>
               </w:rPr>
-              <w:instrText xml:space="preserve"> PAGEREF _Toc230827109 \h </w:instrText>
+              <w:instrText xml:space="preserve"> PAGEREF _Toc230943005 \h </w:instrText>
             </w:r>
             <w:r>
               <w:rPr>
@@ -966,10 +986,14 @@
               <w:tab w:val="right" w:leader="dot" w:pos="9350"/>
             </w:tabs>
             <w:rPr>
+              <w:rFonts w:eastAsiaTheme="minorEastAsia"/>
               <w:noProof/>
+              <w:sz w:val="24"/>
+              <w:szCs w:val="24"/>
+              <w:lang w:val="en-US"/>
             </w:rPr>
           </w:pPr>
-          <w:hyperlink w:anchor="_Toc230827110" w:history="1">
+          <w:hyperlink w:anchor="_Toc230943006" w:history="1">
             <w:r>
               <w:rPr>
                 <w:rStyle w:val="Hyperlink"/>
@@ -996,7 +1020,7 @@
                 <w:noProof/>
                 <w:webHidden/>
               </w:rPr>
-              <w:instrText xml:space="preserve"> PAGEREF _Toc230827110 \h </w:instrText>
+              <w:instrText xml:space="preserve"> PAGEREF _Toc230943006 \h </w:instrText>
             </w:r>
             <w:r>
               <w:rPr>
@@ -1034,10 +1058,14 @@
               <w:tab w:val="right" w:leader="dot" w:pos="9350"/>
             </w:tabs>
             <w:rPr>
+              <w:rFonts w:eastAsiaTheme="minorEastAsia"/>
               <w:noProof/>
+              <w:sz w:val="24"/>
+              <w:szCs w:val="24"/>
+              <w:lang w:val="en-US"/>
             </w:rPr>
           </w:pPr>
-          <w:hyperlink w:anchor="_Toc230827111" w:history="1">
+          <w:hyperlink w:anchor="_Toc230943007" w:history="1">
             <w:r>
               <w:rPr>
                 <w:rStyle w:val="Hyperlink"/>
@@ -1064,7 +1092,7 @@
                 <w:noProof/>
                 <w:webHidden/>
               </w:rPr>
-              <w:instrText xml:space="preserve"> PAGEREF _Toc230827111 \h </w:instrText>
+              <w:instrText xml:space="preserve"> PAGEREF _Toc230943007 \h </w:instrText>
             </w:r>
             <w:r>
               <w:rPr>
@@ -1106,10 +1134,10 @@
               <w:noProof/>
               <w:sz w:val="24"/>
               <w:szCs w:val="24"/>
-              <w:lang w:eastAsia="en-ZA"/>
+              <w:lang w:val="en-US"/>
             </w:rPr>
           </w:pPr>
-          <w:hyperlink w:anchor="_Toc230827112" w:history="1">
+          <w:hyperlink w:anchor="_Toc230943008" w:history="1">
             <w:r>
               <w:rPr>
                 <w:rStyle w:val="Hyperlink"/>
@@ -1136,7 +1164,7 @@
                 <w:noProof/>
                 <w:webHidden/>
               </w:rPr>
-              <w:instrText xml:space="preserve"> PAGEREF _Toc230827112 \h </w:instrText>
+              <w:instrText xml:space="preserve"> PAGEREF _Toc230943008 \h </w:instrText>
             </w:r>
             <w:r>
               <w:rPr>
@@ -1156,7 +1184,7 @@
                 <w:noProof/>
                 <w:webHidden/>
               </w:rPr>
-              <w:t>8</w:t>
+              <w:t>9</w:t>
             </w:r>
             <w:r>
               <w:rPr>
@@ -1174,10 +1202,14 @@
               <w:tab w:val="right" w:leader="dot" w:pos="9350"/>
             </w:tabs>
             <w:rPr>
+              <w:rFonts w:eastAsiaTheme="minorEastAsia"/>
               <w:noProof/>
+              <w:sz w:val="24"/>
+              <w:szCs w:val="24"/>
+              <w:lang w:val="en-US"/>
             </w:rPr>
           </w:pPr>
-          <w:hyperlink w:anchor="_Toc230827113" w:history="1">
+          <w:hyperlink w:anchor="_Toc230943009" w:history="1">
             <w:r>
               <w:rPr>
                 <w:rStyle w:val="Hyperlink"/>
@@ -1204,7 +1236,7 @@
                 <w:noProof/>
                 <w:webHidden/>
               </w:rPr>
-              <w:instrText xml:space="preserve"> PAGEREF _Toc230827113 \h </w:instrText>
+              <w:instrText xml:space="preserve"> PAGEREF _Toc230943009 \h </w:instrText>
             </w:r>
             <w:r>
               <w:rPr>
@@ -1224,7 +1256,7 @@
                 <w:noProof/>
                 <w:webHidden/>
               </w:rPr>
-              <w:t>8</w:t>
+              <w:t>9</w:t>
             </w:r>
             <w:r>
               <w:rPr>
@@ -1242,10 +1274,14 @@
               <w:tab w:val="right" w:leader="dot" w:pos="9350"/>
             </w:tabs>
             <w:rPr>
+              <w:rFonts w:eastAsiaTheme="minorEastAsia"/>
               <w:noProof/>
+              <w:sz w:val="24"/>
+              <w:szCs w:val="24"/>
+              <w:lang w:val="en-US"/>
             </w:rPr>
           </w:pPr>
-          <w:hyperlink w:anchor="_Toc230827114" w:history="1">
+          <w:hyperlink w:anchor="_Toc230943010" w:history="1">
             <w:r>
               <w:rPr>
                 <w:rStyle w:val="Hyperlink"/>
@@ -1272,7 +1308,7 @@
                 <w:noProof/>
                 <w:webHidden/>
               </w:rPr>
-              <w:instrText xml:space="preserve"> PAGEREF _Toc230827114 \h </w:instrText>
+              <w:instrText xml:space="preserve"> PAGEREF _Toc230943010 \h </w:instrText>
             </w:r>
             <w:r>
               <w:rPr>
@@ -1292,7 +1328,7 @@
                 <w:noProof/>
                 <w:webHidden/>
               </w:rPr>
-              <w:t>8</w:t>
+              <w:t>9</w:t>
             </w:r>
             <w:r>
               <w:rPr>
@@ -1310,10 +1346,14 @@
               <w:tab w:val="right" w:leader="dot" w:pos="9350"/>
             </w:tabs>
             <w:rPr>
+              <w:rFonts w:eastAsiaTheme="minorEastAsia"/>
               <w:noProof/>
+              <w:sz w:val="24"/>
+              <w:szCs w:val="24"/>
+              <w:lang w:val="en-US"/>
             </w:rPr>
           </w:pPr>
-          <w:hyperlink w:anchor="_Toc230827115" w:history="1">
+          <w:hyperlink w:anchor="_Toc230943011" w:history="1">
             <w:r>
               <w:rPr>
                 <w:rStyle w:val="Hyperlink"/>
@@ -1340,7 +1380,7 @@
                 <w:noProof/>
                 <w:webHidden/>
               </w:rPr>
-              <w:instrText xml:space="preserve"> PAGEREF _Toc230827115 \h </w:instrText>
+              <w:instrText xml:space="preserve"> PAGEREF _Toc230943011 \h </w:instrText>
             </w:r>
             <w:r>
               <w:rPr>
@@ -1360,7 +1400,7 @@
                 <w:noProof/>
                 <w:webHidden/>
               </w:rPr>
-              <w:t>8</w:t>
+              <w:t>9</w:t>
             </w:r>
             <w:r>
               <w:rPr>
@@ -1378,10 +1418,14 @@
               <w:tab w:val="right" w:leader="dot" w:pos="9350"/>
             </w:tabs>
             <w:rPr>
+              <w:rFonts w:eastAsiaTheme="minorEastAsia"/>
               <w:noProof/>
+              <w:sz w:val="24"/>
+              <w:szCs w:val="24"/>
+              <w:lang w:val="en-US"/>
             </w:rPr>
           </w:pPr>
-          <w:hyperlink w:anchor="_Toc230827116" w:history="1">
+          <w:hyperlink w:anchor="_Toc230943012" w:history="1">
             <w:r>
               <w:rPr>
                 <w:rStyle w:val="Hyperlink"/>
@@ -1408,7 +1452,7 @@
                 <w:noProof/>
                 <w:webHidden/>
               </w:rPr>
-              <w:instrText xml:space="preserve"> PAGEREF _Toc230827116 \h </w:instrText>
+              <w:instrText xml:space="preserve"> PAGEREF _Toc230943012 \h </w:instrText>
             </w:r>
             <w:r>
               <w:rPr>
@@ -1428,7 +1472,7 @@
                 <w:noProof/>
                 <w:webHidden/>
               </w:rPr>
-              <w:t>8</w:t>
+              <w:t>9</w:t>
             </w:r>
             <w:r>
               <w:rPr>
@@ -1446,10 +1490,14 @@
               <w:tab w:val="right" w:leader="dot" w:pos="9350"/>
             </w:tabs>
             <w:rPr>
+              <w:rFonts w:eastAsiaTheme="minorEastAsia"/>
               <w:noProof/>
+              <w:sz w:val="24"/>
+              <w:szCs w:val="24"/>
+              <w:lang w:val="en-US"/>
             </w:rPr>
           </w:pPr>
-          <w:hyperlink w:anchor="_Toc230827117" w:history="1">
+          <w:hyperlink w:anchor="_Toc230943013" w:history="1">
             <w:r>
               <w:rPr>
                 <w:rStyle w:val="Hyperlink"/>
@@ -1476,7 +1524,7 @@
                 <w:noProof/>
                 <w:webHidden/>
               </w:rPr>
-              <w:instrText xml:space="preserve"> PAGEREF _Toc230827117 \h </w:instrText>
+              <w:instrText xml:space="preserve"> PAGEREF _Toc230943013 \h </w:instrText>
             </w:r>
             <w:r>
               <w:rPr>
@@ -1496,7 +1544,7 @@
                 <w:noProof/>
                 <w:webHidden/>
               </w:rPr>
-              <w:t>9</w:t>
+              <w:t>10</w:t>
             </w:r>
             <w:r>
               <w:rPr>
@@ -1514,10 +1562,14 @@
               <w:tab w:val="right" w:leader="dot" w:pos="9350"/>
             </w:tabs>
             <w:rPr>
+              <w:rFonts w:eastAsiaTheme="minorEastAsia"/>
               <w:noProof/>
+              <w:sz w:val="24"/>
+              <w:szCs w:val="24"/>
+              <w:lang w:val="en-US"/>
             </w:rPr>
           </w:pPr>
-          <w:hyperlink w:anchor="_Toc230827118" w:history="1">
+          <w:hyperlink w:anchor="_Toc230943014" w:history="1">
             <w:r>
               <w:rPr>
                 <w:rStyle w:val="Hyperlink"/>
@@ -1544,7 +1596,7 @@
                 <w:noProof/>
                 <w:webHidden/>
               </w:rPr>
-              <w:instrText xml:space="preserve"> PAGEREF _Toc230827118 \h </w:instrText>
+              <w:instrText xml:space="preserve"> PAGEREF _Toc230943014 \h </w:instrText>
             </w:r>
             <w:r>
               <w:rPr>
@@ -1564,7 +1616,7 @@
                 <w:noProof/>
                 <w:webHidden/>
               </w:rPr>
-              <w:t>9</w:t>
+              <w:t>10</w:t>
             </w:r>
             <w:r>
               <w:rPr>
@@ -1586,10 +1638,10 @@
               <w:noProof/>
               <w:sz w:val="24"/>
               <w:szCs w:val="24"/>
-              <w:lang w:eastAsia="en-ZA"/>
+              <w:lang w:val="en-US"/>
             </w:rPr>
           </w:pPr>
-          <w:hyperlink w:anchor="_Toc230827119" w:history="1">
+          <w:hyperlink w:anchor="_Toc230943015" w:history="1">
             <w:r>
               <w:rPr>
                 <w:rStyle w:val="Hyperlink"/>
@@ -1616,7 +1668,7 @@
                 <w:noProof/>
                 <w:webHidden/>
               </w:rPr>
-              <w:instrText xml:space="preserve"> PAGEREF _Toc230827119 \h </w:instrText>
+              <w:instrText xml:space="preserve"> PAGEREF _Toc230943015 \h </w:instrText>
             </w:r>
             <w:r>
               <w:rPr>
@@ -1636,7 +1688,7 @@
                 <w:noProof/>
                 <w:webHidden/>
               </w:rPr>
-              <w:t>10</w:t>
+              <w:t>11</w:t>
             </w:r>
             <w:r>
               <w:rPr>
@@ -1658,10 +1710,10 @@
               <w:noProof/>
               <w:sz w:val="24"/>
               <w:szCs w:val="24"/>
-              <w:lang w:eastAsia="en-ZA"/>
+              <w:lang w:val="en-US"/>
             </w:rPr>
           </w:pPr>
-          <w:hyperlink w:anchor="_Toc230827120" w:history="1">
+          <w:hyperlink w:anchor="_Toc230943016" w:history="1">
             <w:r>
               <w:rPr>
                 <w:rStyle w:val="Hyperlink"/>
@@ -1688,7 +1740,7 @@
                 <w:noProof/>
                 <w:webHidden/>
               </w:rPr>
-              <w:instrText xml:space="preserve"> PAGEREF _Toc230827120 \h </w:instrText>
+              <w:instrText xml:space="preserve"> PAGEREF _Toc230943016 \h </w:instrText>
             </w:r>
             <w:r>
               <w:rPr>
@@ -1708,7 +1760,7 @@
                 <w:noProof/>
                 <w:webHidden/>
               </w:rPr>
-              <w:t>10</w:t>
+              <w:t>11</w:t>
             </w:r>
             <w:r>
               <w:rPr>
@@ -1730,10 +1782,10 @@
               <w:noProof/>
               <w:sz w:val="24"/>
               <w:szCs w:val="24"/>
-              <w:lang w:eastAsia="en-ZA"/>
+              <w:lang w:val="en-US"/>
             </w:rPr>
           </w:pPr>
-          <w:hyperlink w:anchor="_Toc230827121" w:history="1">
+          <w:hyperlink w:anchor="_Toc230943017" w:history="1">
             <w:r>
               <w:rPr>
                 <w:rStyle w:val="Hyperlink"/>
@@ -1760,7 +1812,7 @@
                 <w:noProof/>
                 <w:webHidden/>
               </w:rPr>
-              <w:instrText xml:space="preserve"> PAGEREF _Toc230827121 \h </w:instrText>
+              <w:instrText xml:space="preserve"> PAGEREF _Toc230943017 \h </w:instrText>
             </w:r>
             <w:r>
               <w:rPr>
@@ -1780,7 +1832,7 @@
                 <w:noProof/>
                 <w:webHidden/>
               </w:rPr>
-              <w:t>10</w:t>
+              <w:t>11</w:t>
             </w:r>
             <w:r>
               <w:rPr>
@@ -1802,10 +1854,10 @@
               <w:noProof/>
               <w:sz w:val="24"/>
               <w:szCs w:val="24"/>
-              <w:lang w:eastAsia="en-ZA"/>
+              <w:lang w:val="en-US"/>
             </w:rPr>
           </w:pPr>
-          <w:hyperlink w:anchor="_Toc230827122" w:history="1">
+          <w:hyperlink w:anchor="_Toc230943018" w:history="1">
             <w:r>
               <w:rPr>
                 <w:rStyle w:val="Hyperlink"/>
@@ -1832,7 +1884,7 @@
                 <w:noProof/>
                 <w:webHidden/>
               </w:rPr>
-              <w:instrText xml:space="preserve"> PAGEREF _Toc230827122 \h </w:instrText>
+              <w:instrText xml:space="preserve"> PAGEREF _Toc230943018 \h </w:instrText>
             </w:r>
             <w:r>
               <w:rPr>
@@ -1852,7 +1904,7 @@
                 <w:noProof/>
                 <w:webHidden/>
               </w:rPr>
-              <w:t>11</w:t>
+              <w:t>12</w:t>
             </w:r>
             <w:r>
               <w:rPr>
@@ -1874,10 +1926,10 @@
               <w:noProof/>
               <w:sz w:val="24"/>
               <w:szCs w:val="24"/>
-              <w:lang w:eastAsia="en-ZA"/>
+              <w:lang w:val="en-US"/>
             </w:rPr>
           </w:pPr>
-          <w:hyperlink w:anchor="_Toc230827123" w:history="1">
+          <w:hyperlink w:anchor="_Toc230943019" w:history="1">
             <w:r>
               <w:rPr>
                 <w:rStyle w:val="Hyperlink"/>
@@ -1904,7 +1956,7 @@
                 <w:noProof/>
                 <w:webHidden/>
               </w:rPr>
-              <w:instrText xml:space="preserve"> PAGEREF _Toc230827123 \h </w:instrText>
+              <w:instrText xml:space="preserve"> PAGEREF _Toc230943019 \h </w:instrText>
             </w:r>
             <w:r>
               <w:rPr>
@@ -1924,7 +1976,7 @@
                 <w:noProof/>
                 <w:webHidden/>
               </w:rPr>
-              <w:t>12</w:t>
+              <w:t>13</w:t>
             </w:r>
             <w:r>
               <w:rPr>
@@ -1996,7 +2048,7 @@
       <w:pPr>
         <w:pStyle w:val="Heading1"/>
       </w:pPr>
-      <w:bookmarkStart w:id="0" w:name="_Toc230827100"/>
+      <w:bookmarkStart w:id="0" w:name="_Toc230942996"/>
       <w:r>
         <w:lastRenderedPageBreak/>
         <w:t>Proposal 1: Charles Greenway</w:t>
@@ -2007,7 +2059,7 @@
       <w:pPr>
         <w:pStyle w:val="Heading2"/>
       </w:pPr>
-      <w:bookmarkStart w:id="1" w:name="_Toc230827101"/>
+      <w:bookmarkStart w:id="1" w:name="_Toc230942997"/>
       <w:r>
         <w:t>1. Organisation Overview</w:t>
       </w:r>
@@ -2049,19 +2101,7 @@
         <w:rPr>
           <w:rFonts w:ascii="Aptos" w:hAnsi="Aptos"/>
         </w:rPr>
-        <w:t xml:space="preserve">This business is a service-based business. This means that the employees drive to </w:t>
-      </w:r>
-      <w:r>
-        <w:rPr>
-          <w:rFonts w:ascii="Aptos" w:hAnsi="Aptos"/>
-        </w:rPr>
-        <w:t>customers’</w:t>
-      </w:r>
-      <w:r>
-        <w:rPr>
-          <w:rFonts w:ascii="Aptos" w:hAnsi="Aptos"/>
-        </w:rPr>
-        <w:t xml:space="preserve"> homes or business premises as opposed to a customer coming to a shop. The business was set up to help those who do not have the time, equipment or knowledge to perform tasks to ensure that their garden is clean, healthy and well maintained.</w:t>
+        <w:t>This business is a service-based business. This means that the employees drive to customers’ homes or business premises as opposed to a customer coming to a shop. The business was set up to help those who do not have the time, equipment or knowledge to perform tasks to ensure that their garden is clean, healthy and well maintained.</w:t>
       </w:r>
       <w:r>
         <w:rPr>
@@ -2087,19 +2127,7 @@
         <w:rPr>
           <w:rFonts w:ascii="Aptos" w:hAnsi="Aptos"/>
         </w:rPr>
-        <w:t xml:space="preserve">The objective of the organization is to look after the environment </w:t>
-      </w:r>
-      <w:r>
-        <w:rPr>
-          <w:rFonts w:ascii="Aptos" w:hAnsi="Aptos"/>
-        </w:rPr>
-        <w:t>and</w:t>
-      </w:r>
-      <w:r>
-        <w:rPr>
-          <w:rFonts w:ascii="Aptos" w:hAnsi="Aptos"/>
-        </w:rPr>
-        <w:t xml:space="preserve"> improve the look and cleanliness of outdoor spaces. A well-kept garden improves the overall health of plant life and has benefits for outdoor areas (Royal Horticultural Society 2024). Charles Greenway looks to deliver reliable, professional gardening services that customers can rely on.</w:t>
+        <w:t>The objective of the organization is to look after the environment and improve the look and cleanliness of outdoor spaces. A well-kept garden improves the overall health of plant life and has benefits for outdoor areas (Royal Horticultural Society 2024). Charles Greenway looks to deliver reliable, professional gardening services that customers can rely on.</w:t>
       </w:r>
       <w:r>
         <w:rPr>
@@ -2268,13 +2296,7 @@
         <w:rPr>
           <w:rFonts w:ascii="Aptos" w:hAnsi="Aptos"/>
         </w:rPr>
-        <w:t xml:space="preserve"> </w:t>
-      </w:r>
-      <w:r>
-        <w:rPr>
-          <w:rFonts w:ascii="Aptos" w:hAnsi="Aptos"/>
-        </w:rPr>
-        <w:t>(Charles, 2023)</w:t>
+        <w:t xml:space="preserve"> (Charles, 2023)</w:t>
       </w:r>
     </w:p>
     <w:p>
@@ -2320,7 +2342,7 @@
       <w:pPr>
         <w:pStyle w:val="Heading2"/>
       </w:pPr>
-      <w:bookmarkStart w:id="2" w:name="_Toc230827102"/>
+      <w:bookmarkStart w:id="2" w:name="_Toc230942998"/>
       <w:r>
         <w:t>2.</w:t>
       </w:r>
@@ -2413,12 +2435,6 @@
         <w:gridCol w:w="6895"/>
       </w:tblGrid>
       <w:tr>
-        <w:tblPrEx>
-          <w:tblCellMar>
-            <w:top w:w="0" w:type="dxa"/>
-            <w:bottom w:w="0" w:type="dxa"/>
-          </w:tblCellMar>
-        </w:tblPrEx>
         <w:trPr>
           <w:trHeight w:val="289"/>
         </w:trPr>
@@ -2529,12 +2545,6 @@
         </w:tc>
       </w:tr>
       <w:tr>
-        <w:tblPrEx>
-          <w:tblCellMar>
-            <w:top w:w="0" w:type="dxa"/>
-            <w:bottom w:w="0" w:type="dxa"/>
-          </w:tblCellMar>
-        </w:tblPrEx>
         <w:trPr>
           <w:trHeight w:val="471"/>
         </w:trPr>
@@ -2627,12 +2637,6 @@
         </w:tc>
       </w:tr>
       <w:tr>
-        <w:tblPrEx>
-          <w:tblCellMar>
-            <w:top w:w="0" w:type="dxa"/>
-            <w:bottom w:w="0" w:type="dxa"/>
-          </w:tblCellMar>
-        </w:tblPrEx>
         <w:trPr>
           <w:trHeight w:val="654"/>
         </w:trPr>
@@ -2725,12 +2729,6 @@
         </w:tc>
       </w:tr>
       <w:tr>
-        <w:tblPrEx>
-          <w:tblCellMar>
-            <w:top w:w="0" w:type="dxa"/>
-            <w:bottom w:w="0" w:type="dxa"/>
-          </w:tblCellMar>
-        </w:tblPrEx>
         <w:trPr>
           <w:trHeight w:val="482"/>
         </w:trPr>
@@ -2823,12 +2821,6 @@
         </w:tc>
       </w:tr>
       <w:tr>
-        <w:tblPrEx>
-          <w:tblCellMar>
-            <w:top w:w="0" w:type="dxa"/>
-            <w:bottom w:w="0" w:type="dxa"/>
-          </w:tblCellMar>
-        </w:tblPrEx>
         <w:trPr>
           <w:trHeight w:val="471"/>
         </w:trPr>
@@ -2921,12 +2913,6 @@
         </w:tc>
       </w:tr>
       <w:tr>
-        <w:tblPrEx>
-          <w:tblCellMar>
-            <w:top w:w="0" w:type="dxa"/>
-            <w:bottom w:w="0" w:type="dxa"/>
-          </w:tblCellMar>
-        </w:tblPrEx>
         <w:trPr>
           <w:trHeight w:val="276"/>
         </w:trPr>
@@ -3081,7 +3067,7 @@
       <w:pPr>
         <w:pStyle w:val="Heading2"/>
       </w:pPr>
-      <w:bookmarkStart w:id="3" w:name="_Toc230827103"/>
+      <w:bookmarkStart w:id="3" w:name="_Toc230942999"/>
       <w:r>
         <w:lastRenderedPageBreak/>
         <w:t>3. Proposed Website Features and Functionality</w:t>
@@ -3092,7 +3078,7 @@
       <w:pPr>
         <w:pStyle w:val="Heading3"/>
       </w:pPr>
-      <w:bookmarkStart w:id="4" w:name="_Toc230827104"/>
+      <w:bookmarkStart w:id="4" w:name="_Toc230943000"/>
       <w:r>
         <w:t>3.1 Homepage (index.html)</w:t>
       </w:r>
@@ -3114,13 +3100,7 @@
         <w:rPr>
           <w:rFonts w:ascii="Aptos" w:hAnsi="Aptos"/>
         </w:rPr>
-        <w:t xml:space="preserve"> </w:t>
-      </w:r>
-      <w:r>
-        <w:rPr>
-          <w:rFonts w:ascii="Aptos" w:hAnsi="Aptos"/>
-        </w:rPr>
-        <w:t>(iStock, 2024)</w:t>
+        <w:t xml:space="preserve"> (iStock, 2024)</w:t>
       </w:r>
     </w:p>
     <w:p>
@@ -3137,15 +3117,7 @@
           <w:b/>
           <w:bCs/>
         </w:rPr>
-        <w:t xml:space="preserve">Contents and </w:t>
-      </w:r>
-      <w:r>
-        <w:rPr>
-          <w:rFonts w:ascii="Aptos" w:hAnsi="Aptos"/>
-          <w:b/>
-          <w:bCs/>
-        </w:rPr>
-        <w:t>Features:</w:t>
+        <w:t>Contents and Features:</w:t>
       </w:r>
     </w:p>
     <w:p>
@@ -3163,13 +3135,7 @@
         <w:rPr>
           <w:rFonts w:ascii="Aptos" w:hAnsi="Aptos"/>
         </w:rPr>
-        <w:t>A</w:t>
-      </w:r>
-      <w:r>
-        <w:rPr>
-          <w:rFonts w:ascii="Aptos" w:hAnsi="Aptos"/>
-        </w:rPr>
-        <w:t xml:space="preserve"> full-width hero banner containing a high-quality picture of the garden and a concise header (e.g., 'Your Garden, Our Passion').</w:t>
+        <w:t>A full-width hero banner containing a high-quality picture of the garden and a concise header (e.g., 'Your Garden, Our Passion').</w:t>
       </w:r>
     </w:p>
     <w:p>
@@ -3271,7 +3237,7 @@
       <w:pPr>
         <w:pStyle w:val="Heading3"/>
       </w:pPr>
-      <w:bookmarkStart w:id="5" w:name="_Toc230827105"/>
+      <w:bookmarkStart w:id="5" w:name="_Toc230943001"/>
       <w:r>
         <w:t>3.2 About Page (about.html)</w:t>
       </w:r>
@@ -3408,7 +3374,7 @@
       <w:pPr>
         <w:pStyle w:val="Heading3"/>
       </w:pPr>
-      <w:bookmarkStart w:id="6" w:name="_Toc230827106"/>
+      <w:bookmarkStart w:id="6" w:name="_Toc230943002"/>
       <w:r>
         <w:t>3.3 Services Page (services.html)</w:t>
       </w:r>
@@ -3571,7 +3537,7 @@
       <w:pPr>
         <w:pStyle w:val="Heading3"/>
       </w:pPr>
-      <w:bookmarkStart w:id="7" w:name="_Toc230827107"/>
+      <w:bookmarkStart w:id="7" w:name="_Toc230943003"/>
       <w:r>
         <w:lastRenderedPageBreak/>
         <w:t>3.4 Enquiry Page (enquiry.html)</w:t>
@@ -3709,7 +3675,7 @@
       <w:pPr>
         <w:pStyle w:val="Heading3"/>
       </w:pPr>
-      <w:bookmarkStart w:id="8" w:name="_Toc230827108"/>
+      <w:bookmarkStart w:id="8" w:name="_Toc230943004"/>
       <w:r>
         <w:t>3.5 Contact Page (contact.html)</w:t>
       </w:r>
@@ -3859,7 +3825,7 @@
       <w:pPr>
         <w:pStyle w:val="Heading2"/>
       </w:pPr>
-      <w:bookmarkStart w:id="9" w:name="_Toc230827109"/>
+      <w:bookmarkStart w:id="9" w:name="_Toc230943005"/>
       <w:r>
         <w:lastRenderedPageBreak/>
         <w:t>4. Design and User Experience</w:t>
@@ -3907,7 +3873,7 @@
       <w:pPr>
         <w:pStyle w:val="Heading3"/>
       </w:pPr>
-      <w:bookmarkStart w:id="10" w:name="_Toc230827110"/>
+      <w:bookmarkStart w:id="10" w:name="_Toc230943006"/>
       <w:r>
         <w:t>Colour Template</w:t>
       </w:r>
@@ -3936,12 +3902,6 @@
         <w:gridCol w:w="4688"/>
       </w:tblGrid>
       <w:tr>
-        <w:tblPrEx>
-          <w:tblCellMar>
-            <w:top w:w="0" w:type="dxa"/>
-            <w:bottom w:w="0" w:type="dxa"/>
-          </w:tblCellMar>
-        </w:tblPrEx>
         <w:trPr>
           <w:trHeight w:val="439"/>
         </w:trPr>
@@ -4089,12 +4049,6 @@
         </w:tc>
       </w:tr>
       <w:tr>
-        <w:tblPrEx>
-          <w:tblCellMar>
-            <w:top w:w="0" w:type="dxa"/>
-            <w:bottom w:w="0" w:type="dxa"/>
-          </w:tblCellMar>
-        </w:tblPrEx>
         <w:trPr>
           <w:trHeight w:val="737"/>
         </w:trPr>
@@ -4209,12 +4163,6 @@
         </w:tc>
       </w:tr>
       <w:tr>
-        <w:tblPrEx>
-          <w:tblCellMar>
-            <w:top w:w="0" w:type="dxa"/>
-            <w:bottom w:w="0" w:type="dxa"/>
-          </w:tblCellMar>
-        </w:tblPrEx>
         <w:trPr>
           <w:trHeight w:val="426"/>
         </w:trPr>
@@ -4329,12 +4277,6 @@
         </w:tc>
       </w:tr>
       <w:tr>
-        <w:tblPrEx>
-          <w:tblCellMar>
-            <w:top w:w="0" w:type="dxa"/>
-            <w:bottom w:w="0" w:type="dxa"/>
-          </w:tblCellMar>
-        </w:tblPrEx>
         <w:trPr>
           <w:trHeight w:val="426"/>
         </w:trPr>
@@ -4449,12 +4391,6 @@
         </w:tc>
       </w:tr>
       <w:tr>
-        <w:tblPrEx>
-          <w:tblCellMar>
-            <w:top w:w="0" w:type="dxa"/>
-            <w:bottom w:w="0" w:type="dxa"/>
-          </w:tblCellMar>
-        </w:tblPrEx>
         <w:trPr>
           <w:trHeight w:val="439"/>
         </w:trPr>
@@ -4560,12 +4496,6 @@
         </w:tc>
       </w:tr>
       <w:tr>
-        <w:tblPrEx>
-          <w:tblCellMar>
-            <w:top w:w="0" w:type="dxa"/>
-            <w:bottom w:w="0" w:type="dxa"/>
-          </w:tblCellMar>
-        </w:tblPrEx>
         <w:trPr>
           <w:trHeight w:val="327"/>
         </w:trPr>
@@ -4680,12 +4610,6 @@
         </w:tc>
       </w:tr>
       <w:tr>
-        <w:tblPrEx>
-          <w:tblCellMar>
-            <w:top w:w="0" w:type="dxa"/>
-            <w:bottom w:w="0" w:type="dxa"/>
-          </w:tblCellMar>
-        </w:tblPrEx>
         <w:trPr>
           <w:trHeight w:val="865"/>
         </w:trPr>
@@ -4800,12 +4724,6 @@
         </w:tc>
       </w:tr>
       <w:tr>
-        <w:tblPrEx>
-          <w:tblCellMar>
-            <w:top w:w="0" w:type="dxa"/>
-            <w:bottom w:w="0" w:type="dxa"/>
-          </w:tblCellMar>
-        </w:tblPrEx>
         <w:trPr>
           <w:trHeight w:val="122"/>
         </w:trPr>
@@ -4937,12 +4855,9 @@
       <w:pPr>
         <w:pStyle w:val="Heading3"/>
       </w:pPr>
-      <w:bookmarkStart w:id="11" w:name="_Toc230827111"/>
-      <w:r>
-        <w:t>T</w:t>
-      </w:r>
-      <w:r>
-        <w:t>ypography</w:t>
+      <w:bookmarkStart w:id="11" w:name="_Toc230943007"/>
+      <w:r>
+        <w:t>Typography</w:t>
       </w:r>
       <w:bookmarkEnd w:id="11"/>
     </w:p>
@@ -4968,19 +4883,7 @@
         <w:rPr>
           <w:rFonts w:ascii="Aptos" w:hAnsi="Aptos"/>
         </w:rPr>
-        <w:t xml:space="preserve"> give it a </w:t>
-      </w:r>
-      <w:r>
-        <w:rPr>
-          <w:rFonts w:ascii="Aptos" w:hAnsi="Aptos"/>
-        </w:rPr>
-        <w:t>stronger and more professional</w:t>
-      </w:r>
-      <w:r>
-        <w:rPr>
-          <w:rFonts w:ascii="Aptos" w:hAnsi="Aptos"/>
-        </w:rPr>
-        <w:t xml:space="preserve"> look.</w:t>
+        <w:t xml:space="preserve"> give it a stronger and more professional look.</w:t>
       </w:r>
     </w:p>
     <w:p>
@@ -5012,32 +4915,67 @@
         <w:rPr>
           <w:rFonts w:ascii="Aptos" w:hAnsi="Aptos"/>
         </w:rPr>
-        <w:t xml:space="preserve"> </w:t>
-      </w:r>
-      <w:r>
-        <w:rPr>
-          <w:rFonts w:ascii="Aptos" w:hAnsi="Aptos"/>
-        </w:rPr>
-        <w:t>(OpenAI, 2024)</w:t>
-      </w:r>
-    </w:p>
-    <w:p>
-      <w:pPr>
-        <w:rPr>
-          <w:rFonts w:ascii="Aptos" w:hAnsi="Aptos"/>
-        </w:rPr>
-      </w:pPr>
-    </w:p>
-    <w:p>
-      <w:pPr>
-        <w:rPr>
-          <w:rFonts w:ascii="Aptos" w:hAnsi="Aptos"/>
-        </w:rPr>
-      </w:pPr>
-      <w:r>
-        <w:rPr>
-          <w:rFonts w:ascii="Aptos" w:hAnsi="Aptos"/>
-        </w:rPr>
+        <w:t xml:space="preserve"> (OpenAI, 2024)</w:t>
+      </w:r>
+    </w:p>
+    <w:p>
+      <w:pPr>
+        <w:rPr>
+          <w:rFonts w:ascii="Aptos" w:hAnsi="Aptos"/>
+        </w:rPr>
+      </w:pPr>
+    </w:p>
+    <w:p>
+      <w:pPr>
+        <w:rPr>
+          <w:rFonts w:ascii="Aptos" w:hAnsi="Aptos"/>
+          <w:b/>
+          <w:bCs/>
+        </w:rPr>
+      </w:pPr>
+    </w:p>
+    <w:p>
+      <w:pPr>
+        <w:rPr>
+          <w:rFonts w:ascii="Aptos" w:hAnsi="Aptos"/>
+          <w:b/>
+          <w:bCs/>
+        </w:rPr>
+      </w:pPr>
+    </w:p>
+    <w:p>
+      <w:pPr>
+        <w:rPr>
+          <w:rFonts w:ascii="Aptos" w:hAnsi="Aptos"/>
+          <w:b/>
+          <w:bCs/>
+        </w:rPr>
+      </w:pPr>
+    </w:p>
+    <w:p>
+      <w:pPr>
+        <w:rPr>
+          <w:rFonts w:ascii="Aptos" w:hAnsi="Aptos"/>
+          <w:b/>
+          <w:bCs/>
+        </w:rPr>
+      </w:pPr>
+    </w:p>
+    <w:p>
+      <w:pPr>
+        <w:rPr>
+          <w:rFonts w:ascii="Aptos" w:hAnsi="Aptos"/>
+          <w:b/>
+          <w:bCs/>
+        </w:rPr>
+      </w:pPr>
+      <w:r>
+        <w:rPr>
+          <w:rFonts w:ascii="Aptos" w:hAnsi="Aptos"/>
+          <w:b/>
+          <w:bCs/>
+        </w:rPr>
+        <w:lastRenderedPageBreak/>
         <w:t>Wireframe</w:t>
       </w:r>
     </w:p>
@@ -5045,20 +4983,80 @@
       <w:pPr>
         <w:rPr>
           <w:rFonts w:ascii="Aptos" w:hAnsi="Aptos"/>
-        </w:rPr>
-      </w:pPr>
-    </w:p>
-    <w:p>
-      <w:pPr>
-        <w:rPr>
-          <w:rFonts w:ascii="Aptos" w:hAnsi="Aptos"/>
-        </w:rPr>
-      </w:pPr>
-    </w:p>
-    <w:p>
-      <w:pPr>
-        <w:rPr>
-          <w:rFonts w:ascii="Aptos" w:hAnsi="Aptos"/>
+          <w:b/>
+          <w:bCs/>
+        </w:rPr>
+      </w:pPr>
+      <w:r>
+        <w:rPr>
+          <w:rFonts w:ascii="Aptos" w:hAnsi="Aptos"/>
+          <w:b/>
+          <w:bCs/>
+        </w:rPr>
+        <w:drawing>
+          <wp:inline distT="0" distB="0" distL="0" distR="0" wp14:anchorId="63D9AB6B" wp14:editId="5B653063">
+            <wp:extent cx="5943600" cy="3230245"/>
+            <wp:effectExtent l="0" t="0" r="0" b="8255"/>
+            <wp:docPr id="1981655945" name="Picture 1"/>
+            <wp:cNvGraphicFramePr>
+              <a:graphicFrameLocks xmlns:a="http://schemas.openxmlformats.org/drawingml/2006/main" noChangeAspect="1"/>
+            </wp:cNvGraphicFramePr>
+            <a:graphic xmlns:a="http://schemas.openxmlformats.org/drawingml/2006/main">
+              <a:graphicData uri="http://schemas.openxmlformats.org/drawingml/2006/picture">
+                <pic:pic xmlns:pic="http://schemas.openxmlformats.org/drawingml/2006/picture">
+                  <pic:nvPicPr>
+                    <pic:cNvPr id="1981655945" name=""/>
+                    <pic:cNvPicPr/>
+                  </pic:nvPicPr>
+                  <pic:blipFill>
+                    <a:blip r:embed="rId9"/>
+                    <a:stretch>
+                      <a:fillRect/>
+                    </a:stretch>
+                  </pic:blipFill>
+                  <pic:spPr>
+                    <a:xfrm>
+                      <a:off x="0" y="0"/>
+                      <a:ext cx="5943600" cy="3230245"/>
+                    </a:xfrm>
+                    <a:prstGeom prst="rect">
+                      <a:avLst/>
+                    </a:prstGeom>
+                  </pic:spPr>
+                </pic:pic>
+              </a:graphicData>
+            </a:graphic>
+          </wp:inline>
+        </w:drawing>
+      </w:r>
+    </w:p>
+    <w:p>
+      <w:pPr>
+        <w:rPr>
+          <w:rFonts w:ascii="Aptos" w:hAnsi="Aptos"/>
+        </w:rPr>
+      </w:pPr>
+    </w:p>
+    <w:p>
+      <w:r>
+        <w:t>(Anthropic, 2026)</w:t>
+      </w:r>
+    </w:p>
+    <w:p/>
+    <w:p>
+      <w:r>
+        <w:br w:type="page"/>
+      </w:r>
+    </w:p>
+    <w:p>
+      <w:pPr>
+        <w:rPr>
+          <w:rFonts w:ascii="Aptos" w:eastAsiaTheme="majorEastAsia" w:hAnsi="Aptos" w:cstheme="majorBidi"/>
+          <w:b/>
+          <w:bCs/>
+          <w:color w:val="9BBB59" w:themeColor="accent3"/>
+          <w:sz w:val="24"/>
+          <w:szCs w:val="24"/>
         </w:rPr>
       </w:pPr>
     </w:p>
@@ -5066,9 +5064,28 @@
       <w:pPr>
         <w:pStyle w:val="Heading2"/>
       </w:pPr>
-      <w:bookmarkStart w:id="12" w:name="_Toc230827112"/>
-      <w:r>
-        <w:lastRenderedPageBreak/>
+    </w:p>
+    <w:p>
+      <w:pPr>
+        <w:rPr>
+          <w:rFonts w:ascii="Aptos" w:eastAsiaTheme="majorEastAsia" w:hAnsi="Aptos" w:cstheme="majorBidi"/>
+          <w:b/>
+          <w:bCs/>
+          <w:color w:val="9BBB59" w:themeColor="accent3"/>
+          <w:sz w:val="24"/>
+          <w:szCs w:val="24"/>
+        </w:rPr>
+      </w:pPr>
+      <w:r>
+        <w:br w:type="page"/>
+      </w:r>
+    </w:p>
+    <w:p>
+      <w:pPr>
+        <w:pStyle w:val="Heading2"/>
+      </w:pPr>
+      <w:bookmarkStart w:id="12" w:name="_Toc230943008"/>
+      <w:r>
         <w:t>5. Technical Requirements</w:t>
       </w:r>
       <w:bookmarkEnd w:id="12"/>
@@ -5077,7 +5094,7 @@
       <w:pPr>
         <w:pStyle w:val="Heading3"/>
       </w:pPr>
-      <w:bookmarkStart w:id="13" w:name="_Toc230827113"/>
+      <w:bookmarkStart w:id="13" w:name="_Toc230943009"/>
       <w:r>
         <w:t>Infrastructure &amp; Hosting</w:t>
       </w:r>
@@ -5210,7 +5227,7 @@
       <w:pPr>
         <w:pStyle w:val="Heading3"/>
       </w:pPr>
-      <w:bookmarkStart w:id="14" w:name="_Toc230827114"/>
+      <w:bookmarkStart w:id="14" w:name="_Toc230943010"/>
       <w:r>
         <w:t>Hosting Requirements:</w:t>
       </w:r>
@@ -5323,7 +5340,7 @@
       <w:pPr>
         <w:pStyle w:val="Heading3"/>
       </w:pPr>
-      <w:bookmarkStart w:id="15" w:name="_Toc230827115"/>
+      <w:bookmarkStart w:id="15" w:name="_Toc230943011"/>
       <w:r>
         <w:t>Performance &amp; Accessibility</w:t>
       </w:r>
@@ -5479,7 +5496,7 @@
       <w:pPr>
         <w:pStyle w:val="Heading3"/>
       </w:pPr>
-      <w:bookmarkStart w:id="16" w:name="_Toc230827116"/>
+      <w:bookmarkStart w:id="16" w:name="_Toc230943012"/>
       <w:r>
         <w:t>Security &amp; Compliance</w:t>
       </w:r>
@@ -5639,9 +5656,8 @@
       <w:pPr>
         <w:pStyle w:val="Heading3"/>
       </w:pPr>
-      <w:bookmarkStart w:id="17" w:name="_Toc230827117"/>
-      <w:r>
-        <w:lastRenderedPageBreak/>
+      <w:bookmarkStart w:id="17" w:name="_Toc230943013"/>
+      <w:r>
         <w:t>Functional Integrations</w:t>
       </w:r>
       <w:bookmarkEnd w:id="17"/>
@@ -5771,7 +5787,7 @@
       <w:pPr>
         <w:pStyle w:val="Heading3"/>
       </w:pPr>
-      <w:bookmarkStart w:id="18" w:name="_Toc230827118"/>
+      <w:bookmarkStart w:id="18" w:name="_Toc230943014"/>
       <w:r>
         <w:t>Ongoing Maintenance</w:t>
       </w:r>
@@ -5935,7 +5951,7 @@
       <w:pPr>
         <w:pStyle w:val="Heading2"/>
       </w:pPr>
-      <w:bookmarkStart w:id="19" w:name="_Toc230827119"/>
+      <w:bookmarkStart w:id="19" w:name="_Toc230943015"/>
       <w:r>
         <w:lastRenderedPageBreak/>
         <w:t>6. Timeline and Budget</w:t>
@@ -5946,7 +5962,7 @@
       <w:pPr>
         <w:pStyle w:val="Heading2"/>
       </w:pPr>
-      <w:bookmarkStart w:id="20" w:name="_Toc230827120"/>
+      <w:bookmarkStart w:id="20" w:name="_Toc230943016"/>
       <w:r>
         <w:t>Timeline</w:t>
       </w:r>
@@ -7054,7 +7070,7 @@
           <w:u w:val="words"/>
         </w:rPr>
       </w:pPr>
-      <w:bookmarkStart w:id="21" w:name="_Toc230827121"/>
+      <w:bookmarkStart w:id="21" w:name="_Toc230943017"/>
       <w:r>
         <w:t>Budget</w:t>
       </w:r>
@@ -7712,7 +7728,7 @@
       <w:pPr>
         <w:pStyle w:val="Heading2"/>
       </w:pPr>
-      <w:bookmarkStart w:id="22" w:name="_Toc230827122"/>
+      <w:bookmarkStart w:id="22" w:name="_Toc230943018"/>
       <w:r>
         <w:lastRenderedPageBreak/>
         <w:t>7. References:</w:t>
@@ -7731,13 +7747,13 @@
           <w:b/>
           <w:bCs/>
         </w:rPr>
-        <w:t>Charles, I. (2023).</w:t>
-      </w:r>
-      <w:r>
-        <w:rPr>
-          <w:rFonts w:ascii="Aptos" w:hAnsi="Aptos"/>
-        </w:rPr>
-        <w:t xml:space="preserve"> Business Plan: Charles Greenway. Unpublished internal document.</w:t>
+        <w:t>Anthropic (2026)</w:t>
+      </w:r>
+      <w:r>
+        <w:rPr>
+          <w:rFonts w:ascii="Aptos" w:hAnsi="Aptos"/>
+        </w:rPr>
+        <w:t xml:space="preserve"> Website wireframe designs for Charles Greenway [Digital wireframe]. Generated using Claude Sonnet 4.6. Accessed: 29 May 2026.</w:t>
       </w:r>
     </w:p>
     <w:p>
@@ -7752,6 +7768,27 @@
           <w:b/>
           <w:bCs/>
         </w:rPr>
+        <w:t>Charles, I. (2023).</w:t>
+      </w:r>
+      <w:r>
+        <w:rPr>
+          <w:rFonts w:ascii="Aptos" w:hAnsi="Aptos"/>
+        </w:rPr>
+        <w:t xml:space="preserve"> Business Plan: Charles Greenway. Unpublished internal document.</w:t>
+      </w:r>
+    </w:p>
+    <w:p>
+      <w:pPr>
+        <w:rPr>
+          <w:rFonts w:ascii="Aptos" w:hAnsi="Aptos"/>
+        </w:rPr>
+      </w:pPr>
+      <w:r>
+        <w:rPr>
+          <w:rFonts w:ascii="Aptos" w:hAnsi="Aptos"/>
+          <w:b/>
+          <w:bCs/>
+        </w:rPr>
         <w:t>Da Veiga, A., Abdullah, H., Eybers, S., Ochola, E., Mujinga, M. and Mwim, E. (2024)</w:t>
       </w:r>
       <w:r>
@@ -7774,7 +7811,7 @@
         </w:rPr>
         <w:t xml:space="preserve">, 6(4), pp. 2693–2732. Available at: </w:t>
       </w:r>
-      <w:hyperlink r:id="rId9" w:history="1">
+      <w:hyperlink r:id="rId10" w:history="1">
         <w:r>
           <w:rPr>
             <w:rStyle w:val="Hyperlink"/>
@@ -7824,7 +7861,7 @@
         </w:rPr>
         <w:t xml:space="preserve">. Available at: </w:t>
       </w:r>
-      <w:hyperlink r:id="rId10" w:history="1">
+      <w:hyperlink r:id="rId11" w:history="1">
         <w:r>
           <w:rPr>
             <w:rStyle w:val="Hyperlink"/>
@@ -7860,7 +7897,7 @@
         </w:rPr>
         <w:t xml:space="preserve"> Contemporary Garden stock photos. Available at: </w:t>
       </w:r>
-      <w:hyperlink r:id="rId11" w:history="1">
+      <w:hyperlink r:id="rId12" w:history="1">
         <w:r>
           <w:rPr>
             <w:rStyle w:val="Hyperlink"/>
@@ -7910,7 +7947,7 @@
         </w:rPr>
         <w:t xml:space="preserve">. Available at: </w:t>
       </w:r>
-      <w:hyperlink r:id="rId12" w:history="1">
+      <w:hyperlink r:id="rId13" w:history="1">
         <w:r>
           <w:rPr>
             <w:rStyle w:val="Hyperlink"/>
@@ -7960,7 +7997,7 @@
         </w:rPr>
         <w:t xml:space="preserve">. Available at: </w:t>
       </w:r>
-      <w:hyperlink r:id="rId13" w:history="1">
+      <w:hyperlink r:id="rId14" w:history="1">
         <w:r>
           <w:rPr>
             <w:rStyle w:val="Hyperlink"/>
@@ -8010,7 +8047,7 @@
         </w:rPr>
         <w:t xml:space="preserve">. Available at: </w:t>
       </w:r>
-      <w:hyperlink r:id="rId14" w:history="1">
+      <w:hyperlink r:id="rId15" w:history="1">
         <w:r>
           <w:rPr>
             <w:rStyle w:val="Hyperlink"/>
@@ -8093,7 +8130,7 @@
         </w:rPr>
         <w:t xml:space="preserve"> Garden maintenance. Available at: </w:t>
       </w:r>
-      <w:hyperlink r:id="rId15" w:history="1">
+      <w:hyperlink r:id="rId16" w:history="1">
         <w:r>
           <w:rPr>
             <w:rStyle w:val="Hyperlink"/>
@@ -8143,7 +8180,7 @@
         </w:rPr>
         <w:t xml:space="preserve">. Available at: </w:t>
       </w:r>
-      <w:hyperlink r:id="rId16" w:history="1">
+      <w:hyperlink r:id="rId17" w:history="1">
         <w:r>
           <w:rPr>
             <w:rStyle w:val="Hyperlink"/>
@@ -8179,7 +8216,7 @@
       <w:pPr>
         <w:pStyle w:val="Heading1"/>
       </w:pPr>
-      <w:bookmarkStart w:id="23" w:name="_Toc230827123"/>
+      <w:bookmarkStart w:id="23" w:name="_Toc230943019"/>
       <w:r>
         <w:lastRenderedPageBreak/>
         <w:t>Sitemap:</w:t>
@@ -8208,7 +8245,7 @@
             <wp:cNvGraphicFramePr/>
             <a:graphic xmlns:a="http://schemas.openxmlformats.org/drawingml/2006/main">
               <a:graphicData uri="http://schemas.openxmlformats.org/drawingml/2006/diagram">
-                <dgm:relIds xmlns:dgm="http://schemas.openxmlformats.org/drawingml/2006/diagram" xmlns:r="http://schemas.openxmlformats.org/officeDocument/2006/relationships" r:dm="rId17" r:lo="rId18" r:qs="rId19" r:cs="rId20"/>
+                <dgm:relIds xmlns:dgm="http://schemas.openxmlformats.org/drawingml/2006/diagram" xmlns:r="http://schemas.openxmlformats.org/officeDocument/2006/relationships" r:dm="rId18" r:lo="rId19" r:qs="rId20" r:cs="rId21"/>
               </a:graphicData>
             </a:graphic>
           </wp:inline>
@@ -14354,7 +14391,7 @@
   <dgm:whole/>
   <dgm:extLst>
     <a:ext uri="http://schemas.microsoft.com/office/drawing/2008/diagram">
-      <dsp:dataModelExt xmlns:dsp="http://schemas.microsoft.com/office/drawing/2008/diagram" relId="rId21" minVer="http://schemas.openxmlformats.org/drawingml/2006/diagram"/>
+      <dsp:dataModelExt xmlns:dsp="http://schemas.microsoft.com/office/drawing/2008/diagram" relId="rId22" minVer="http://schemas.openxmlformats.org/drawingml/2006/diagram"/>
     </a:ext>
   </dgm:extLst>
 </dgm:dataModel>

</xml_diff>

<commit_message>
Added content and research to proposal and fied Readme
</commit_message>
<xml_diff>
--- a/Doccuments/Proposal 1.docx
+++ b/Doccuments/Proposal 1.docx
@@ -273,7 +273,7 @@
           <w:r>
             <w:fldChar w:fldCharType="separate"/>
           </w:r>
-          <w:hyperlink w:anchor="_Toc230942996" w:history="1">
+          <w:hyperlink w:anchor="_Toc232598513" w:history="1">
             <w:r>
               <w:rPr>
                 <w:rStyle w:val="Hyperlink"/>
@@ -300,7 +300,7 @@
                 <w:noProof/>
                 <w:webHidden/>
               </w:rPr>
-              <w:instrText xml:space="preserve"> PAGEREF _Toc230942996 \h </w:instrText>
+              <w:instrText xml:space="preserve"> PAGEREF _Toc232598513 \h </w:instrText>
             </w:r>
             <w:r>
               <w:rPr>
@@ -320,7 +320,7 @@
                 <w:noProof/>
                 <w:webHidden/>
               </w:rPr>
-              <w:t>3</w:t>
+              <w:t>4</w:t>
             </w:r>
             <w:r>
               <w:rPr>
@@ -345,7 +345,7 @@
               <w:lang w:val="en-US"/>
             </w:rPr>
           </w:pPr>
-          <w:hyperlink w:anchor="_Toc230942997" w:history="1">
+          <w:hyperlink w:anchor="_Toc232598514" w:history="1">
             <w:r>
               <w:rPr>
                 <w:rStyle w:val="Hyperlink"/>
@@ -372,7 +372,7 @@
                 <w:noProof/>
                 <w:webHidden/>
               </w:rPr>
-              <w:instrText xml:space="preserve"> PAGEREF _Toc230942997 \h </w:instrText>
+              <w:instrText xml:space="preserve"> PAGEREF _Toc232598514 \h </w:instrText>
             </w:r>
             <w:r>
               <w:rPr>
@@ -392,7 +392,7 @@
                 <w:noProof/>
                 <w:webHidden/>
               </w:rPr>
-              <w:t>3</w:t>
+              <w:t>4</w:t>
             </w:r>
             <w:r>
               <w:rPr>
@@ -417,7 +417,7 @@
               <w:lang w:val="en-US"/>
             </w:rPr>
           </w:pPr>
-          <w:hyperlink w:anchor="_Toc230942998" w:history="1">
+          <w:hyperlink w:anchor="_Toc232598515" w:history="1">
             <w:r>
               <w:rPr>
                 <w:rStyle w:val="Hyperlink"/>
@@ -444,7 +444,7 @@
                 <w:noProof/>
                 <w:webHidden/>
               </w:rPr>
-              <w:instrText xml:space="preserve"> PAGEREF _Toc230942998 \h </w:instrText>
+              <w:instrText xml:space="preserve"> PAGEREF _Toc232598515 \h </w:instrText>
             </w:r>
             <w:r>
               <w:rPr>
@@ -464,7 +464,7 @@
                 <w:noProof/>
                 <w:webHidden/>
               </w:rPr>
-              <w:t>4</w:t>
+              <w:t>5</w:t>
             </w:r>
             <w:r>
               <w:rPr>
@@ -489,7 +489,7 @@
               <w:lang w:val="en-US"/>
             </w:rPr>
           </w:pPr>
-          <w:hyperlink w:anchor="_Toc230942999" w:history="1">
+          <w:hyperlink w:anchor="_Toc232598516" w:history="1">
             <w:r>
               <w:rPr>
                 <w:rStyle w:val="Hyperlink"/>
@@ -516,7 +516,7 @@
                 <w:noProof/>
                 <w:webHidden/>
               </w:rPr>
-              <w:instrText xml:space="preserve"> PAGEREF _Toc230942999 \h </w:instrText>
+              <w:instrText xml:space="preserve"> PAGEREF _Toc232598516 \h </w:instrText>
             </w:r>
             <w:r>
               <w:rPr>
@@ -536,7 +536,7 @@
                 <w:noProof/>
                 <w:webHidden/>
               </w:rPr>
-              <w:t>5</w:t>
+              <w:t>6</w:t>
             </w:r>
             <w:r>
               <w:rPr>
@@ -561,7 +561,7 @@
               <w:lang w:val="en-US"/>
             </w:rPr>
           </w:pPr>
-          <w:hyperlink w:anchor="_Toc230943000" w:history="1">
+          <w:hyperlink w:anchor="_Toc232598517" w:history="1">
             <w:r>
               <w:rPr>
                 <w:rStyle w:val="Hyperlink"/>
@@ -588,7 +588,7 @@
                 <w:noProof/>
                 <w:webHidden/>
               </w:rPr>
-              <w:instrText xml:space="preserve"> PAGEREF _Toc230943000 \h </w:instrText>
+              <w:instrText xml:space="preserve"> PAGEREF _Toc232598517 \h </w:instrText>
             </w:r>
             <w:r>
               <w:rPr>
@@ -608,7 +608,7 @@
                 <w:noProof/>
                 <w:webHidden/>
               </w:rPr>
-              <w:t>5</w:t>
+              <w:t>6</w:t>
             </w:r>
             <w:r>
               <w:rPr>
@@ -633,7 +633,7 @@
               <w:lang w:val="en-US"/>
             </w:rPr>
           </w:pPr>
-          <w:hyperlink w:anchor="_Toc230943001" w:history="1">
+          <w:hyperlink w:anchor="_Toc232598518" w:history="1">
             <w:r>
               <w:rPr>
                 <w:rStyle w:val="Hyperlink"/>
@@ -660,7 +660,7 @@
                 <w:noProof/>
                 <w:webHidden/>
               </w:rPr>
-              <w:instrText xml:space="preserve"> PAGEREF _Toc230943001 \h </w:instrText>
+              <w:instrText xml:space="preserve"> PAGEREF _Toc232598518 \h </w:instrText>
             </w:r>
             <w:r>
               <w:rPr>
@@ -680,7 +680,7 @@
                 <w:noProof/>
                 <w:webHidden/>
               </w:rPr>
-              <w:t>5</w:t>
+              <w:t>6</w:t>
             </w:r>
             <w:r>
               <w:rPr>
@@ -705,7 +705,7 @@
               <w:lang w:val="en-US"/>
             </w:rPr>
           </w:pPr>
-          <w:hyperlink w:anchor="_Toc230943002" w:history="1">
+          <w:hyperlink w:anchor="_Toc232598519" w:history="1">
             <w:r>
               <w:rPr>
                 <w:rStyle w:val="Hyperlink"/>
@@ -732,7 +732,7 @@
                 <w:noProof/>
                 <w:webHidden/>
               </w:rPr>
-              <w:instrText xml:space="preserve"> PAGEREF _Toc230943002 \h </w:instrText>
+              <w:instrText xml:space="preserve"> PAGEREF _Toc232598519 \h </w:instrText>
             </w:r>
             <w:r>
               <w:rPr>
@@ -752,7 +752,7 @@
                 <w:noProof/>
                 <w:webHidden/>
               </w:rPr>
-              <w:t>5</w:t>
+              <w:t>6</w:t>
             </w:r>
             <w:r>
               <w:rPr>
@@ -777,7 +777,7 @@
               <w:lang w:val="en-US"/>
             </w:rPr>
           </w:pPr>
-          <w:hyperlink w:anchor="_Toc230943003" w:history="1">
+          <w:hyperlink w:anchor="_Toc232598520" w:history="1">
             <w:r>
               <w:rPr>
                 <w:rStyle w:val="Hyperlink"/>
@@ -804,7 +804,7 @@
                 <w:noProof/>
                 <w:webHidden/>
               </w:rPr>
-              <w:instrText xml:space="preserve"> PAGEREF _Toc230943003 \h </w:instrText>
+              <w:instrText xml:space="preserve"> PAGEREF _Toc232598520 \h </w:instrText>
             </w:r>
             <w:r>
               <w:rPr>
@@ -824,7 +824,7 @@
                 <w:noProof/>
                 <w:webHidden/>
               </w:rPr>
-              <w:t>6</w:t>
+              <w:t>7</w:t>
             </w:r>
             <w:r>
               <w:rPr>
@@ -849,7 +849,7 @@
               <w:lang w:val="en-US"/>
             </w:rPr>
           </w:pPr>
-          <w:hyperlink w:anchor="_Toc230943004" w:history="1">
+          <w:hyperlink w:anchor="_Toc232598521" w:history="1">
             <w:r>
               <w:rPr>
                 <w:rStyle w:val="Hyperlink"/>
@@ -876,7 +876,7 @@
                 <w:noProof/>
                 <w:webHidden/>
               </w:rPr>
-              <w:instrText xml:space="preserve"> PAGEREF _Toc230943004 \h </w:instrText>
+              <w:instrText xml:space="preserve"> PAGEREF _Toc232598521 \h </w:instrText>
             </w:r>
             <w:r>
               <w:rPr>
@@ -896,7 +896,7 @@
                 <w:noProof/>
                 <w:webHidden/>
               </w:rPr>
-              <w:t>6</w:t>
+              <w:t>7</w:t>
             </w:r>
             <w:r>
               <w:rPr>
@@ -921,7 +921,7 @@
               <w:lang w:val="en-US"/>
             </w:rPr>
           </w:pPr>
-          <w:hyperlink w:anchor="_Toc230943005" w:history="1">
+          <w:hyperlink w:anchor="_Toc232598522" w:history="1">
             <w:r>
               <w:rPr>
                 <w:rStyle w:val="Hyperlink"/>
@@ -948,7 +948,7 @@
                 <w:noProof/>
                 <w:webHidden/>
               </w:rPr>
-              <w:instrText xml:space="preserve"> PAGEREF _Toc230943005 \h </w:instrText>
+              <w:instrText xml:space="preserve"> PAGEREF _Toc232598522 \h </w:instrText>
             </w:r>
             <w:r>
               <w:rPr>
@@ -968,7 +968,7 @@
                 <w:noProof/>
                 <w:webHidden/>
               </w:rPr>
-              <w:t>7</w:t>
+              <w:t>8</w:t>
             </w:r>
             <w:r>
               <w:rPr>
@@ -993,7 +993,7 @@
               <w:lang w:val="en-US"/>
             </w:rPr>
           </w:pPr>
-          <w:hyperlink w:anchor="_Toc230943006" w:history="1">
+          <w:hyperlink w:anchor="_Toc232598523" w:history="1">
             <w:r>
               <w:rPr>
                 <w:rStyle w:val="Hyperlink"/>
@@ -1020,7 +1020,7 @@
                 <w:noProof/>
                 <w:webHidden/>
               </w:rPr>
-              <w:instrText xml:space="preserve"> PAGEREF _Toc230943006 \h </w:instrText>
+              <w:instrText xml:space="preserve"> PAGEREF _Toc232598523 \h </w:instrText>
             </w:r>
             <w:r>
               <w:rPr>
@@ -1040,7 +1040,7 @@
                 <w:noProof/>
                 <w:webHidden/>
               </w:rPr>
-              <w:t>7</w:t>
+              <w:t>8</w:t>
             </w:r>
             <w:r>
               <w:rPr>
@@ -1065,7 +1065,7 @@
               <w:lang w:val="en-US"/>
             </w:rPr>
           </w:pPr>
-          <w:hyperlink w:anchor="_Toc230943007" w:history="1">
+          <w:hyperlink w:anchor="_Toc232598524" w:history="1">
             <w:r>
               <w:rPr>
                 <w:rStyle w:val="Hyperlink"/>
@@ -1092,7 +1092,7 @@
                 <w:noProof/>
                 <w:webHidden/>
               </w:rPr>
-              <w:instrText xml:space="preserve"> PAGEREF _Toc230943007 \h </w:instrText>
+              <w:instrText xml:space="preserve"> PAGEREF _Toc232598524 \h </w:instrText>
             </w:r>
             <w:r>
               <w:rPr>
@@ -1112,7 +1112,7 @@
                 <w:noProof/>
                 <w:webHidden/>
               </w:rPr>
-              <w:t>7</w:t>
+              <w:t>8</w:t>
             </w:r>
             <w:r>
               <w:rPr>
@@ -1137,7 +1137,7 @@
               <w:lang w:val="en-US"/>
             </w:rPr>
           </w:pPr>
-          <w:hyperlink w:anchor="_Toc230943008" w:history="1">
+          <w:hyperlink w:anchor="_Toc232598525" w:history="1">
             <w:r>
               <w:rPr>
                 <w:rStyle w:val="Hyperlink"/>
@@ -1164,7 +1164,7 @@
                 <w:noProof/>
                 <w:webHidden/>
               </w:rPr>
-              <w:instrText xml:space="preserve"> PAGEREF _Toc230943008 \h </w:instrText>
+              <w:instrText xml:space="preserve"> PAGEREF _Toc232598525 \h </w:instrText>
             </w:r>
             <w:r>
               <w:rPr>
@@ -1184,7 +1184,7 @@
                 <w:noProof/>
                 <w:webHidden/>
               </w:rPr>
-              <w:t>9</w:t>
+              <w:t>10</w:t>
             </w:r>
             <w:r>
               <w:rPr>
@@ -1209,7 +1209,7 @@
               <w:lang w:val="en-US"/>
             </w:rPr>
           </w:pPr>
-          <w:hyperlink w:anchor="_Toc230943009" w:history="1">
+          <w:hyperlink w:anchor="_Toc232598526" w:history="1">
             <w:r>
               <w:rPr>
                 <w:rStyle w:val="Hyperlink"/>
@@ -1236,7 +1236,7 @@
                 <w:noProof/>
                 <w:webHidden/>
               </w:rPr>
-              <w:instrText xml:space="preserve"> PAGEREF _Toc230943009 \h </w:instrText>
+              <w:instrText xml:space="preserve"> PAGEREF _Toc232598526 \h </w:instrText>
             </w:r>
             <w:r>
               <w:rPr>
@@ -1256,7 +1256,7 @@
                 <w:noProof/>
                 <w:webHidden/>
               </w:rPr>
-              <w:t>9</w:t>
+              <w:t>10</w:t>
             </w:r>
             <w:r>
               <w:rPr>
@@ -1281,7 +1281,7 @@
               <w:lang w:val="en-US"/>
             </w:rPr>
           </w:pPr>
-          <w:hyperlink w:anchor="_Toc230943010" w:history="1">
+          <w:hyperlink w:anchor="_Toc232598527" w:history="1">
             <w:r>
               <w:rPr>
                 <w:rStyle w:val="Hyperlink"/>
@@ -1308,7 +1308,7 @@
                 <w:noProof/>
                 <w:webHidden/>
               </w:rPr>
-              <w:instrText xml:space="preserve"> PAGEREF _Toc230943010 \h </w:instrText>
+              <w:instrText xml:space="preserve"> PAGEREF _Toc232598527 \h </w:instrText>
             </w:r>
             <w:r>
               <w:rPr>
@@ -1328,7 +1328,7 @@
                 <w:noProof/>
                 <w:webHidden/>
               </w:rPr>
-              <w:t>9</w:t>
+              <w:t>10</w:t>
             </w:r>
             <w:r>
               <w:rPr>
@@ -1353,7 +1353,7 @@
               <w:lang w:val="en-US"/>
             </w:rPr>
           </w:pPr>
-          <w:hyperlink w:anchor="_Toc230943011" w:history="1">
+          <w:hyperlink w:anchor="_Toc232598528" w:history="1">
             <w:r>
               <w:rPr>
                 <w:rStyle w:val="Hyperlink"/>
@@ -1380,7 +1380,7 @@
                 <w:noProof/>
                 <w:webHidden/>
               </w:rPr>
-              <w:instrText xml:space="preserve"> PAGEREF _Toc230943011 \h </w:instrText>
+              <w:instrText xml:space="preserve"> PAGEREF _Toc232598528 \h </w:instrText>
             </w:r>
             <w:r>
               <w:rPr>
@@ -1400,7 +1400,7 @@
                 <w:noProof/>
                 <w:webHidden/>
               </w:rPr>
-              <w:t>9</w:t>
+              <w:t>10</w:t>
             </w:r>
             <w:r>
               <w:rPr>
@@ -1425,7 +1425,7 @@
               <w:lang w:val="en-US"/>
             </w:rPr>
           </w:pPr>
-          <w:hyperlink w:anchor="_Toc230943012" w:history="1">
+          <w:hyperlink w:anchor="_Toc232598529" w:history="1">
             <w:r>
               <w:rPr>
                 <w:rStyle w:val="Hyperlink"/>
@@ -1452,7 +1452,7 @@
                 <w:noProof/>
                 <w:webHidden/>
               </w:rPr>
-              <w:instrText xml:space="preserve"> PAGEREF _Toc230943012 \h </w:instrText>
+              <w:instrText xml:space="preserve"> PAGEREF _Toc232598529 \h </w:instrText>
             </w:r>
             <w:r>
               <w:rPr>
@@ -1472,7 +1472,7 @@
                 <w:noProof/>
                 <w:webHidden/>
               </w:rPr>
-              <w:t>9</w:t>
+              <w:t>10</w:t>
             </w:r>
             <w:r>
               <w:rPr>
@@ -1497,7 +1497,7 @@
               <w:lang w:val="en-US"/>
             </w:rPr>
           </w:pPr>
-          <w:hyperlink w:anchor="_Toc230943013" w:history="1">
+          <w:hyperlink w:anchor="_Toc232598530" w:history="1">
             <w:r>
               <w:rPr>
                 <w:rStyle w:val="Hyperlink"/>
@@ -1524,7 +1524,7 @@
                 <w:noProof/>
                 <w:webHidden/>
               </w:rPr>
-              <w:instrText xml:space="preserve"> PAGEREF _Toc230943013 \h </w:instrText>
+              <w:instrText xml:space="preserve"> PAGEREF _Toc232598530 \h </w:instrText>
             </w:r>
             <w:r>
               <w:rPr>
@@ -1544,7 +1544,7 @@
                 <w:noProof/>
                 <w:webHidden/>
               </w:rPr>
-              <w:t>10</w:t>
+              <w:t>11</w:t>
             </w:r>
             <w:r>
               <w:rPr>
@@ -1569,7 +1569,7 @@
               <w:lang w:val="en-US"/>
             </w:rPr>
           </w:pPr>
-          <w:hyperlink w:anchor="_Toc230943014" w:history="1">
+          <w:hyperlink w:anchor="_Toc232598531" w:history="1">
             <w:r>
               <w:rPr>
                 <w:rStyle w:val="Hyperlink"/>
@@ -1596,7 +1596,7 @@
                 <w:noProof/>
                 <w:webHidden/>
               </w:rPr>
-              <w:instrText xml:space="preserve"> PAGEREF _Toc230943014 \h </w:instrText>
+              <w:instrText xml:space="preserve"> PAGEREF _Toc232598531 \h </w:instrText>
             </w:r>
             <w:r>
               <w:rPr>
@@ -1616,7 +1616,7 @@
                 <w:noProof/>
                 <w:webHidden/>
               </w:rPr>
-              <w:t>10</w:t>
+              <w:t>11</w:t>
             </w:r>
             <w:r>
               <w:rPr>
@@ -1641,7 +1641,7 @@
               <w:lang w:val="en-US"/>
             </w:rPr>
           </w:pPr>
-          <w:hyperlink w:anchor="_Toc230943015" w:history="1">
+          <w:hyperlink w:anchor="_Toc232598532" w:history="1">
             <w:r>
               <w:rPr>
                 <w:rStyle w:val="Hyperlink"/>
@@ -1668,7 +1668,7 @@
                 <w:noProof/>
                 <w:webHidden/>
               </w:rPr>
-              <w:instrText xml:space="preserve"> PAGEREF _Toc230943015 \h </w:instrText>
+              <w:instrText xml:space="preserve"> PAGEREF _Toc232598532 \h </w:instrText>
             </w:r>
             <w:r>
               <w:rPr>
@@ -1688,7 +1688,7 @@
                 <w:noProof/>
                 <w:webHidden/>
               </w:rPr>
-              <w:t>11</w:t>
+              <w:t>12</w:t>
             </w:r>
             <w:r>
               <w:rPr>
@@ -1713,7 +1713,7 @@
               <w:lang w:val="en-US"/>
             </w:rPr>
           </w:pPr>
-          <w:hyperlink w:anchor="_Toc230943016" w:history="1">
+          <w:hyperlink w:anchor="_Toc232598533" w:history="1">
             <w:r>
               <w:rPr>
                 <w:rStyle w:val="Hyperlink"/>
@@ -1740,7 +1740,7 @@
                 <w:noProof/>
                 <w:webHidden/>
               </w:rPr>
-              <w:instrText xml:space="preserve"> PAGEREF _Toc230943016 \h </w:instrText>
+              <w:instrText xml:space="preserve"> PAGEREF _Toc232598533 \h </w:instrText>
             </w:r>
             <w:r>
               <w:rPr>
@@ -1760,7 +1760,7 @@
                 <w:noProof/>
                 <w:webHidden/>
               </w:rPr>
-              <w:t>11</w:t>
+              <w:t>12</w:t>
             </w:r>
             <w:r>
               <w:rPr>
@@ -1785,7 +1785,7 @@
               <w:lang w:val="en-US"/>
             </w:rPr>
           </w:pPr>
-          <w:hyperlink w:anchor="_Toc230943017" w:history="1">
+          <w:hyperlink w:anchor="_Toc232598534" w:history="1">
             <w:r>
               <w:rPr>
                 <w:rStyle w:val="Hyperlink"/>
@@ -1812,7 +1812,7 @@
                 <w:noProof/>
                 <w:webHidden/>
               </w:rPr>
-              <w:instrText xml:space="preserve"> PAGEREF _Toc230943017 \h </w:instrText>
+              <w:instrText xml:space="preserve"> PAGEREF _Toc232598534 \h </w:instrText>
             </w:r>
             <w:r>
               <w:rPr>
@@ -1832,7 +1832,7 @@
                 <w:noProof/>
                 <w:webHidden/>
               </w:rPr>
-              <w:t>11</w:t>
+              <w:t>12</w:t>
             </w:r>
             <w:r>
               <w:rPr>
@@ -1857,7 +1857,7 @@
               <w:lang w:val="en-US"/>
             </w:rPr>
           </w:pPr>
-          <w:hyperlink w:anchor="_Toc230943018" w:history="1">
+          <w:hyperlink w:anchor="_Toc232598535" w:history="1">
             <w:r>
               <w:rPr>
                 <w:rStyle w:val="Hyperlink"/>
@@ -1884,7 +1884,7 @@
                 <w:noProof/>
                 <w:webHidden/>
               </w:rPr>
-              <w:instrText xml:space="preserve"> PAGEREF _Toc230943018 \h </w:instrText>
+              <w:instrText xml:space="preserve"> PAGEREF _Toc232598535 \h </w:instrText>
             </w:r>
             <w:r>
               <w:rPr>
@@ -1904,7 +1904,517 @@
                 <w:noProof/>
                 <w:webHidden/>
               </w:rPr>
-              <w:t>12</w:t>
+              <w:t>13</w:t>
+            </w:r>
+            <w:r>
+              <w:rPr>
+                <w:noProof/>
+                <w:webHidden/>
+              </w:rPr>
+              <w:fldChar w:fldCharType="end"/>
+            </w:r>
+          </w:hyperlink>
+        </w:p>
+        <w:p>
+          <w:pPr>
+            <w:pStyle w:val="TOC2"/>
+            <w:tabs>
+              <w:tab w:val="right" w:leader="dot" w:pos="9350"/>
+            </w:tabs>
+            <w:rPr>
+              <w:rFonts w:eastAsiaTheme="minorEastAsia"/>
+              <w:noProof/>
+              <w:sz w:val="24"/>
+              <w:szCs w:val="24"/>
+              <w:lang w:val="en-US"/>
+            </w:rPr>
+          </w:pPr>
+          <w:hyperlink w:anchor="_Toc232598536" w:history="1">
+            <w:r>
+              <w:rPr>
+                <w:rStyle w:val="Hyperlink"/>
+                <w:noProof/>
+              </w:rPr>
+              <w:t>Content Research and Sourcing</w:t>
+            </w:r>
+            <w:r>
+              <w:rPr>
+                <w:noProof/>
+                <w:webHidden/>
+              </w:rPr>
+              <w:tab/>
+            </w:r>
+            <w:r>
+              <w:rPr>
+                <w:noProof/>
+                <w:webHidden/>
+              </w:rPr>
+              <w:fldChar w:fldCharType="begin"/>
+            </w:r>
+            <w:r>
+              <w:rPr>
+                <w:noProof/>
+                <w:webHidden/>
+              </w:rPr>
+              <w:instrText xml:space="preserve"> PAGEREF _Toc232598536 \h </w:instrText>
+            </w:r>
+            <w:r>
+              <w:rPr>
+                <w:noProof/>
+                <w:webHidden/>
+              </w:rPr>
+            </w:r>
+            <w:r>
+              <w:rPr>
+                <w:noProof/>
+                <w:webHidden/>
+              </w:rPr>
+              <w:fldChar w:fldCharType="separate"/>
+            </w:r>
+            <w:r>
+              <w:rPr>
+                <w:noProof/>
+                <w:webHidden/>
+              </w:rPr>
+              <w:t>14</w:t>
+            </w:r>
+            <w:r>
+              <w:rPr>
+                <w:noProof/>
+                <w:webHidden/>
+              </w:rPr>
+              <w:fldChar w:fldCharType="end"/>
+            </w:r>
+          </w:hyperlink>
+        </w:p>
+        <w:p>
+          <w:pPr>
+            <w:pStyle w:val="TOC3"/>
+            <w:tabs>
+              <w:tab w:val="right" w:leader="dot" w:pos="9350"/>
+            </w:tabs>
+            <w:rPr>
+              <w:rFonts w:eastAsiaTheme="minorEastAsia"/>
+              <w:noProof/>
+              <w:sz w:val="24"/>
+              <w:szCs w:val="24"/>
+              <w:lang w:val="en-US"/>
+            </w:rPr>
+          </w:pPr>
+          <w:hyperlink w:anchor="_Toc232598537" w:history="1">
+            <w:r>
+              <w:rPr>
+                <w:rStyle w:val="Hyperlink"/>
+                <w:noProof/>
+                <w:lang w:val="en-US"/>
+              </w:rPr>
+              <w:t>Organization’s Existing Information</w:t>
+            </w:r>
+            <w:r>
+              <w:rPr>
+                <w:noProof/>
+                <w:webHidden/>
+              </w:rPr>
+              <w:tab/>
+            </w:r>
+            <w:r>
+              <w:rPr>
+                <w:noProof/>
+                <w:webHidden/>
+              </w:rPr>
+              <w:fldChar w:fldCharType="begin"/>
+            </w:r>
+            <w:r>
+              <w:rPr>
+                <w:noProof/>
+                <w:webHidden/>
+              </w:rPr>
+              <w:instrText xml:space="preserve"> PAGEREF _Toc232598537 \h </w:instrText>
+            </w:r>
+            <w:r>
+              <w:rPr>
+                <w:noProof/>
+                <w:webHidden/>
+              </w:rPr>
+            </w:r>
+            <w:r>
+              <w:rPr>
+                <w:noProof/>
+                <w:webHidden/>
+              </w:rPr>
+              <w:fldChar w:fldCharType="separate"/>
+            </w:r>
+            <w:r>
+              <w:rPr>
+                <w:noProof/>
+                <w:webHidden/>
+              </w:rPr>
+              <w:t>14</w:t>
+            </w:r>
+            <w:r>
+              <w:rPr>
+                <w:noProof/>
+                <w:webHidden/>
+              </w:rPr>
+              <w:fldChar w:fldCharType="end"/>
+            </w:r>
+          </w:hyperlink>
+        </w:p>
+        <w:p>
+          <w:pPr>
+            <w:pStyle w:val="TOC3"/>
+            <w:tabs>
+              <w:tab w:val="right" w:leader="dot" w:pos="9350"/>
+            </w:tabs>
+            <w:rPr>
+              <w:rFonts w:eastAsiaTheme="minorEastAsia"/>
+              <w:noProof/>
+              <w:sz w:val="24"/>
+              <w:szCs w:val="24"/>
+              <w:lang w:val="en-US"/>
+            </w:rPr>
+          </w:pPr>
+          <w:hyperlink w:anchor="_Toc232598538" w:history="1">
+            <w:r>
+              <w:rPr>
+                <w:rStyle w:val="Hyperlink"/>
+                <w:noProof/>
+                <w:lang w:val="en-US"/>
+              </w:rPr>
+              <w:t>Social Media Sources</w:t>
+            </w:r>
+            <w:r>
+              <w:rPr>
+                <w:noProof/>
+                <w:webHidden/>
+              </w:rPr>
+              <w:tab/>
+            </w:r>
+            <w:r>
+              <w:rPr>
+                <w:noProof/>
+                <w:webHidden/>
+              </w:rPr>
+              <w:fldChar w:fldCharType="begin"/>
+            </w:r>
+            <w:r>
+              <w:rPr>
+                <w:noProof/>
+                <w:webHidden/>
+              </w:rPr>
+              <w:instrText xml:space="preserve"> PAGEREF _Toc232598538 \h </w:instrText>
+            </w:r>
+            <w:r>
+              <w:rPr>
+                <w:noProof/>
+                <w:webHidden/>
+              </w:rPr>
+            </w:r>
+            <w:r>
+              <w:rPr>
+                <w:noProof/>
+                <w:webHidden/>
+              </w:rPr>
+              <w:fldChar w:fldCharType="separate"/>
+            </w:r>
+            <w:r>
+              <w:rPr>
+                <w:noProof/>
+                <w:webHidden/>
+              </w:rPr>
+              <w:t>14</w:t>
+            </w:r>
+            <w:r>
+              <w:rPr>
+                <w:noProof/>
+                <w:webHidden/>
+              </w:rPr>
+              <w:fldChar w:fldCharType="end"/>
+            </w:r>
+          </w:hyperlink>
+        </w:p>
+        <w:p>
+          <w:pPr>
+            <w:pStyle w:val="TOC3"/>
+            <w:tabs>
+              <w:tab w:val="right" w:leader="dot" w:pos="9350"/>
+            </w:tabs>
+            <w:rPr>
+              <w:rFonts w:eastAsiaTheme="minorEastAsia"/>
+              <w:noProof/>
+              <w:sz w:val="24"/>
+              <w:szCs w:val="24"/>
+              <w:lang w:val="en-US"/>
+            </w:rPr>
+          </w:pPr>
+          <w:hyperlink w:anchor="_Toc232598539" w:history="1">
+            <w:r>
+              <w:rPr>
+                <w:rStyle w:val="Hyperlink"/>
+                <w:noProof/>
+                <w:lang w:val="en-US"/>
+              </w:rPr>
+              <w:t>Public Domain and Creative Commons Resources</w:t>
+            </w:r>
+            <w:r>
+              <w:rPr>
+                <w:noProof/>
+                <w:webHidden/>
+              </w:rPr>
+              <w:tab/>
+            </w:r>
+            <w:r>
+              <w:rPr>
+                <w:noProof/>
+                <w:webHidden/>
+              </w:rPr>
+              <w:fldChar w:fldCharType="begin"/>
+            </w:r>
+            <w:r>
+              <w:rPr>
+                <w:noProof/>
+                <w:webHidden/>
+              </w:rPr>
+              <w:instrText xml:space="preserve"> PAGEREF _Toc232598539 \h </w:instrText>
+            </w:r>
+            <w:r>
+              <w:rPr>
+                <w:noProof/>
+                <w:webHidden/>
+              </w:rPr>
+            </w:r>
+            <w:r>
+              <w:rPr>
+                <w:noProof/>
+                <w:webHidden/>
+              </w:rPr>
+              <w:fldChar w:fldCharType="separate"/>
+            </w:r>
+            <w:r>
+              <w:rPr>
+                <w:noProof/>
+                <w:webHidden/>
+              </w:rPr>
+              <w:t>14</w:t>
+            </w:r>
+            <w:r>
+              <w:rPr>
+                <w:noProof/>
+                <w:webHidden/>
+              </w:rPr>
+              <w:fldChar w:fldCharType="end"/>
+            </w:r>
+          </w:hyperlink>
+        </w:p>
+        <w:p>
+          <w:pPr>
+            <w:pStyle w:val="TOC3"/>
+            <w:tabs>
+              <w:tab w:val="right" w:leader="dot" w:pos="9350"/>
+            </w:tabs>
+            <w:rPr>
+              <w:rFonts w:eastAsiaTheme="minorEastAsia"/>
+              <w:noProof/>
+              <w:sz w:val="24"/>
+              <w:szCs w:val="24"/>
+              <w:lang w:val="en-US"/>
+            </w:rPr>
+          </w:pPr>
+          <w:hyperlink w:anchor="_Toc232598540" w:history="1">
+            <w:r>
+              <w:rPr>
+                <w:rStyle w:val="Hyperlink"/>
+                <w:noProof/>
+                <w:lang w:val="en-US"/>
+              </w:rPr>
+              <w:t>Original Content Creation</w:t>
+            </w:r>
+            <w:r>
+              <w:rPr>
+                <w:noProof/>
+                <w:webHidden/>
+              </w:rPr>
+              <w:tab/>
+            </w:r>
+            <w:r>
+              <w:rPr>
+                <w:noProof/>
+                <w:webHidden/>
+              </w:rPr>
+              <w:fldChar w:fldCharType="begin"/>
+            </w:r>
+            <w:r>
+              <w:rPr>
+                <w:noProof/>
+                <w:webHidden/>
+              </w:rPr>
+              <w:instrText xml:space="preserve"> PAGEREF _Toc232598540 \h </w:instrText>
+            </w:r>
+            <w:r>
+              <w:rPr>
+                <w:noProof/>
+                <w:webHidden/>
+              </w:rPr>
+            </w:r>
+            <w:r>
+              <w:rPr>
+                <w:noProof/>
+                <w:webHidden/>
+              </w:rPr>
+              <w:fldChar w:fldCharType="separate"/>
+            </w:r>
+            <w:r>
+              <w:rPr>
+                <w:noProof/>
+                <w:webHidden/>
+              </w:rPr>
+              <w:t>14</w:t>
+            </w:r>
+            <w:r>
+              <w:rPr>
+                <w:noProof/>
+                <w:webHidden/>
+              </w:rPr>
+              <w:fldChar w:fldCharType="end"/>
+            </w:r>
+          </w:hyperlink>
+        </w:p>
+        <w:p>
+          <w:pPr>
+            <w:pStyle w:val="TOC3"/>
+            <w:tabs>
+              <w:tab w:val="right" w:leader="dot" w:pos="9350"/>
+            </w:tabs>
+            <w:rPr>
+              <w:rFonts w:eastAsiaTheme="minorEastAsia"/>
+              <w:noProof/>
+              <w:sz w:val="24"/>
+              <w:szCs w:val="24"/>
+              <w:lang w:val="en-US"/>
+            </w:rPr>
+          </w:pPr>
+          <w:hyperlink w:anchor="_Toc232598541" w:history="1">
+            <w:r>
+              <w:rPr>
+                <w:rStyle w:val="Hyperlink"/>
+                <w:noProof/>
+                <w:lang w:val="en-US"/>
+              </w:rPr>
+              <w:t>Content Allocation by Page</w:t>
+            </w:r>
+            <w:r>
+              <w:rPr>
+                <w:noProof/>
+                <w:webHidden/>
+              </w:rPr>
+              <w:tab/>
+            </w:r>
+            <w:r>
+              <w:rPr>
+                <w:noProof/>
+                <w:webHidden/>
+              </w:rPr>
+              <w:fldChar w:fldCharType="begin"/>
+            </w:r>
+            <w:r>
+              <w:rPr>
+                <w:noProof/>
+                <w:webHidden/>
+              </w:rPr>
+              <w:instrText xml:space="preserve"> PAGEREF _Toc232598541 \h </w:instrText>
+            </w:r>
+            <w:r>
+              <w:rPr>
+                <w:noProof/>
+                <w:webHidden/>
+              </w:rPr>
+            </w:r>
+            <w:r>
+              <w:rPr>
+                <w:noProof/>
+                <w:webHidden/>
+              </w:rPr>
+              <w:fldChar w:fldCharType="separate"/>
+            </w:r>
+            <w:r>
+              <w:rPr>
+                <w:noProof/>
+                <w:webHidden/>
+              </w:rPr>
+              <w:t>14</w:t>
+            </w:r>
+            <w:r>
+              <w:rPr>
+                <w:noProof/>
+                <w:webHidden/>
+              </w:rPr>
+              <w:fldChar w:fldCharType="end"/>
+            </w:r>
+          </w:hyperlink>
+        </w:p>
+        <w:p>
+          <w:pPr>
+            <w:pStyle w:val="TOC3"/>
+            <w:tabs>
+              <w:tab w:val="right" w:leader="dot" w:pos="9350"/>
+            </w:tabs>
+            <w:rPr>
+              <w:rFonts w:eastAsiaTheme="minorEastAsia"/>
+              <w:noProof/>
+              <w:sz w:val="24"/>
+              <w:szCs w:val="24"/>
+              <w:lang w:val="en-US"/>
+            </w:rPr>
+          </w:pPr>
+          <w:hyperlink w:anchor="_Toc232598542" w:history="1">
+            <w:r>
+              <w:rPr>
+                <w:rStyle w:val="Hyperlink"/>
+                <w:noProof/>
+                <w:lang w:val="en-US"/>
+              </w:rPr>
+              <w:t>Images used throughout the project and website</w:t>
+            </w:r>
+            <w:r>
+              <w:rPr>
+                <w:noProof/>
+                <w:webHidden/>
+              </w:rPr>
+              <w:tab/>
+            </w:r>
+            <w:r>
+              <w:rPr>
+                <w:noProof/>
+                <w:webHidden/>
+              </w:rPr>
+              <w:fldChar w:fldCharType="begin"/>
+            </w:r>
+            <w:r>
+              <w:rPr>
+                <w:noProof/>
+                <w:webHidden/>
+              </w:rPr>
+              <w:instrText xml:space="preserve"> PAGEREF _Toc232598542 \h </w:instrText>
+            </w:r>
+            <w:r>
+              <w:rPr>
+                <w:noProof/>
+                <w:webHidden/>
+              </w:rPr>
+            </w:r>
+            <w:r>
+              <w:rPr>
+                <w:noProof/>
+                <w:webHidden/>
+              </w:rPr>
+              <w:fldChar w:fldCharType="separate"/>
+            </w:r>
+            <w:r>
+              <w:rPr>
+                <w:noProof/>
+                <w:webHidden/>
+              </w:rPr>
+              <w:t>15</w:t>
             </w:r>
             <w:r>
               <w:rPr>
@@ -1929,7 +2439,7 @@
               <w:lang w:val="en-US"/>
             </w:rPr>
           </w:pPr>
-          <w:hyperlink w:anchor="_Toc230943019" w:history="1">
+          <w:hyperlink w:anchor="_Toc232598543" w:history="1">
             <w:r>
               <w:rPr>
                 <w:rStyle w:val="Hyperlink"/>
@@ -1956,7 +2466,7 @@
                 <w:noProof/>
                 <w:webHidden/>
               </w:rPr>
-              <w:instrText xml:space="preserve"> PAGEREF _Toc230943019 \h </w:instrText>
+              <w:instrText xml:space="preserve"> PAGEREF _Toc232598543 \h </w:instrText>
             </w:r>
             <w:r>
               <w:rPr>
@@ -1976,7 +2486,7 @@
                 <w:noProof/>
                 <w:webHidden/>
               </w:rPr>
-              <w:t>13</w:t>
+              <w:t>16</w:t>
             </w:r>
             <w:r>
               <w:rPr>
@@ -2026,29 +2536,9 @@
     </w:p>
     <w:p>
       <w:pPr>
-        <w:rPr>
-          <w:rFonts w:ascii="Aptos" w:hAnsi="Aptos"/>
-          <w:b/>
-          <w:bCs/>
-        </w:rPr>
-      </w:pPr>
-      <w:r>
-        <w:rPr>
-          <w:rFonts w:ascii="Aptos" w:hAnsi="Aptos"/>
-          <w:b/>
-          <w:bCs/>
-          <w:sz w:val="96"/>
-          <w:szCs w:val="96"/>
-          <w:lang w:val="en-US"/>
-        </w:rPr>
-        <w:br w:type="page"/>
-      </w:r>
-    </w:p>
-    <w:p>
-      <w:pPr>
         <w:pStyle w:val="Heading1"/>
       </w:pPr>
-      <w:bookmarkStart w:id="0" w:name="_Toc230942996"/>
+      <w:bookmarkStart w:id="0" w:name="_Toc232598513"/>
       <w:r>
         <w:lastRenderedPageBreak/>
         <w:t>Proposal 1: Charles Greenway</w:t>
@@ -2059,7 +2549,7 @@
       <w:pPr>
         <w:pStyle w:val="Heading2"/>
       </w:pPr>
-      <w:bookmarkStart w:id="1" w:name="_Toc230942997"/>
+      <w:bookmarkStart w:id="1" w:name="_Toc232598514"/>
       <w:r>
         <w:t>1. Organisation Overview</w:t>
       </w:r>
@@ -2342,7 +2832,7 @@
       <w:pPr>
         <w:pStyle w:val="Heading2"/>
       </w:pPr>
-      <w:bookmarkStart w:id="2" w:name="_Toc230942998"/>
+      <w:bookmarkStart w:id="2" w:name="_Toc232598515"/>
       <w:r>
         <w:t>2.</w:t>
       </w:r>
@@ -3067,7 +3557,7 @@
       <w:pPr>
         <w:pStyle w:val="Heading2"/>
       </w:pPr>
-      <w:bookmarkStart w:id="3" w:name="_Toc230942999"/>
+      <w:bookmarkStart w:id="3" w:name="_Toc232598516"/>
       <w:r>
         <w:lastRenderedPageBreak/>
         <w:t>3. Proposed Website Features and Functionality</w:t>
@@ -3078,7 +3568,7 @@
       <w:pPr>
         <w:pStyle w:val="Heading3"/>
       </w:pPr>
-      <w:bookmarkStart w:id="4" w:name="_Toc230943000"/>
+      <w:bookmarkStart w:id="4" w:name="_Toc232598517"/>
       <w:r>
         <w:t>3.1 Homepage (index.html)</w:t>
       </w:r>
@@ -3237,7 +3727,7 @@
       <w:pPr>
         <w:pStyle w:val="Heading3"/>
       </w:pPr>
-      <w:bookmarkStart w:id="5" w:name="_Toc230943001"/>
+      <w:bookmarkStart w:id="5" w:name="_Toc232598518"/>
       <w:r>
         <w:t>3.2 About Page (about.html)</w:t>
       </w:r>
@@ -3374,7 +3864,7 @@
       <w:pPr>
         <w:pStyle w:val="Heading3"/>
       </w:pPr>
-      <w:bookmarkStart w:id="6" w:name="_Toc230943002"/>
+      <w:bookmarkStart w:id="6" w:name="_Toc232598519"/>
       <w:r>
         <w:t>3.3 Services Page (services.html)</w:t>
       </w:r>
@@ -3537,7 +4027,7 @@
       <w:pPr>
         <w:pStyle w:val="Heading3"/>
       </w:pPr>
-      <w:bookmarkStart w:id="7" w:name="_Toc230943003"/>
+      <w:bookmarkStart w:id="7" w:name="_Toc232598520"/>
       <w:r>
         <w:lastRenderedPageBreak/>
         <w:t>3.4 Enquiry Page (enquiry.html)</w:t>
@@ -3675,7 +4165,7 @@
       <w:pPr>
         <w:pStyle w:val="Heading3"/>
       </w:pPr>
-      <w:bookmarkStart w:id="8" w:name="_Toc230943004"/>
+      <w:bookmarkStart w:id="8" w:name="_Toc232598521"/>
       <w:r>
         <w:t>3.5 Contact Page (contact.html)</w:t>
       </w:r>
@@ -3825,7 +4315,7 @@
       <w:pPr>
         <w:pStyle w:val="Heading2"/>
       </w:pPr>
-      <w:bookmarkStart w:id="9" w:name="_Toc230943005"/>
+      <w:bookmarkStart w:id="9" w:name="_Toc232598522"/>
       <w:r>
         <w:lastRenderedPageBreak/>
         <w:t>4. Design and User Experience</w:t>
@@ -3873,7 +4363,7 @@
       <w:pPr>
         <w:pStyle w:val="Heading3"/>
       </w:pPr>
-      <w:bookmarkStart w:id="10" w:name="_Toc230943006"/>
+      <w:bookmarkStart w:id="10" w:name="_Toc232598523"/>
       <w:r>
         <w:t>Colour Template</w:t>
       </w:r>
@@ -4855,7 +5345,7 @@
       <w:pPr>
         <w:pStyle w:val="Heading3"/>
       </w:pPr>
-      <w:bookmarkStart w:id="11" w:name="_Toc230943007"/>
+      <w:bookmarkStart w:id="11" w:name="_Toc232598524"/>
       <w:r>
         <w:t>Typography</w:t>
       </w:r>
@@ -4992,6 +5482,7 @@
           <w:rFonts w:ascii="Aptos" w:hAnsi="Aptos"/>
           <w:b/>
           <w:bCs/>
+          <w:noProof/>
         </w:rPr>
         <w:drawing>
           <wp:inline distT="0" distB="0" distL="0" distR="0" wp14:anchorId="63D9AB6B" wp14:editId="5B653063">
@@ -5050,42 +5541,11 @@
     </w:p>
     <w:p>
       <w:pPr>
-        <w:rPr>
-          <w:rFonts w:ascii="Aptos" w:eastAsiaTheme="majorEastAsia" w:hAnsi="Aptos" w:cstheme="majorBidi"/>
-          <w:b/>
-          <w:bCs/>
-          <w:color w:val="9BBB59" w:themeColor="accent3"/>
-          <w:sz w:val="24"/>
-          <w:szCs w:val="24"/>
-        </w:rPr>
-      </w:pPr>
-    </w:p>
-    <w:p>
-      <w:pPr>
         <w:pStyle w:val="Heading2"/>
       </w:pPr>
-    </w:p>
-    <w:p>
-      <w:pPr>
-        <w:rPr>
-          <w:rFonts w:ascii="Aptos" w:eastAsiaTheme="majorEastAsia" w:hAnsi="Aptos" w:cstheme="majorBidi"/>
-          <w:b/>
-          <w:bCs/>
-          <w:color w:val="9BBB59" w:themeColor="accent3"/>
-          <w:sz w:val="24"/>
-          <w:szCs w:val="24"/>
-        </w:rPr>
-      </w:pPr>
-      <w:r>
-        <w:br w:type="page"/>
-      </w:r>
-    </w:p>
-    <w:p>
-      <w:pPr>
-        <w:pStyle w:val="Heading2"/>
-      </w:pPr>
-      <w:bookmarkStart w:id="12" w:name="_Toc230943008"/>
-      <w:r>
+      <w:bookmarkStart w:id="12" w:name="_Toc232598525"/>
+      <w:r>
+        <w:lastRenderedPageBreak/>
         <w:t>5. Technical Requirements</w:t>
       </w:r>
       <w:bookmarkEnd w:id="12"/>
@@ -5094,7 +5554,7 @@
       <w:pPr>
         <w:pStyle w:val="Heading3"/>
       </w:pPr>
-      <w:bookmarkStart w:id="13" w:name="_Toc230943009"/>
+      <w:bookmarkStart w:id="13" w:name="_Toc232598526"/>
       <w:r>
         <w:t>Infrastructure &amp; Hosting</w:t>
       </w:r>
@@ -5227,7 +5687,7 @@
       <w:pPr>
         <w:pStyle w:val="Heading3"/>
       </w:pPr>
-      <w:bookmarkStart w:id="14" w:name="_Toc230943010"/>
+      <w:bookmarkStart w:id="14" w:name="_Toc232598527"/>
       <w:r>
         <w:t>Hosting Requirements:</w:t>
       </w:r>
@@ -5340,7 +5800,7 @@
       <w:pPr>
         <w:pStyle w:val="Heading3"/>
       </w:pPr>
-      <w:bookmarkStart w:id="15" w:name="_Toc230943011"/>
+      <w:bookmarkStart w:id="15" w:name="_Toc232598528"/>
       <w:r>
         <w:t>Performance &amp; Accessibility</w:t>
       </w:r>
@@ -5496,7 +5956,7 @@
       <w:pPr>
         <w:pStyle w:val="Heading3"/>
       </w:pPr>
-      <w:bookmarkStart w:id="16" w:name="_Toc230943012"/>
+      <w:bookmarkStart w:id="16" w:name="_Toc232598529"/>
       <w:r>
         <w:t>Security &amp; Compliance</w:t>
       </w:r>
@@ -5656,8 +6116,9 @@
       <w:pPr>
         <w:pStyle w:val="Heading3"/>
       </w:pPr>
-      <w:bookmarkStart w:id="17" w:name="_Toc230943013"/>
-      <w:r>
+      <w:bookmarkStart w:id="17" w:name="_Toc232598530"/>
+      <w:r>
+        <w:lastRenderedPageBreak/>
         <w:t>Functional Integrations</w:t>
       </w:r>
       <w:bookmarkEnd w:id="17"/>
@@ -5787,7 +6248,7 @@
       <w:pPr>
         <w:pStyle w:val="Heading3"/>
       </w:pPr>
-      <w:bookmarkStart w:id="18" w:name="_Toc230943014"/>
+      <w:bookmarkStart w:id="18" w:name="_Toc232598531"/>
       <w:r>
         <w:t>Ongoing Maintenance</w:t>
       </w:r>
@@ -5951,7 +6412,7 @@
       <w:pPr>
         <w:pStyle w:val="Heading2"/>
       </w:pPr>
-      <w:bookmarkStart w:id="19" w:name="_Toc230943015"/>
+      <w:bookmarkStart w:id="19" w:name="_Toc232598532"/>
       <w:r>
         <w:lastRenderedPageBreak/>
         <w:t>6. Timeline and Budget</w:t>
@@ -5962,7 +6423,7 @@
       <w:pPr>
         <w:pStyle w:val="Heading2"/>
       </w:pPr>
-      <w:bookmarkStart w:id="20" w:name="_Toc230943016"/>
+      <w:bookmarkStart w:id="20" w:name="_Toc232598533"/>
       <w:r>
         <w:t>Timeline</w:t>
       </w:r>
@@ -7070,7 +7531,7 @@
           <w:u w:val="words"/>
         </w:rPr>
       </w:pPr>
-      <w:bookmarkStart w:id="21" w:name="_Toc230943017"/>
+      <w:bookmarkStart w:id="21" w:name="_Toc232598534"/>
       <w:r>
         <w:t>Budget</w:t>
       </w:r>
@@ -7728,7 +8189,7 @@
       <w:pPr>
         <w:pStyle w:val="Heading2"/>
       </w:pPr>
-      <w:bookmarkStart w:id="22" w:name="_Toc230943018"/>
+      <w:bookmarkStart w:id="22" w:name="_Toc232598535"/>
       <w:r>
         <w:lastRenderedPageBreak/>
         <w:t>7. References:</w:t>
@@ -8087,14 +8548,7 @@
         <w:rPr>
           <w:rFonts w:ascii="Aptos" w:hAnsi="Aptos"/>
         </w:rPr>
-        <w:t xml:space="preserve">, Aswell as colour scheme and </w:t>
-      </w:r>
-      <w:proofErr w:type="gramStart"/>
-      <w:r>
-        <w:rPr>
-          <w:rFonts w:ascii="Aptos" w:hAnsi="Aptos"/>
-        </w:rPr>
-        <w:t>fonts</w:t>
+        <w:t>, Aswell as colour scheme and fonts</w:t>
       </w:r>
       <w:r>
         <w:rPr>
@@ -8102,7 +8556,6 @@
         </w:rPr>
         <w:t>(</w:t>
       </w:r>
-      <w:proofErr w:type="gramEnd"/>
       <w:r>
         <w:rPr>
           <w:rFonts w:ascii="Aptos" w:hAnsi="Aptos"/>
@@ -8200,6 +8653,675 @@
       <w:pPr>
         <w:rPr>
           <w:rFonts w:ascii="Aptos" w:hAnsi="Aptos"/>
+        </w:rPr>
+      </w:pPr>
+      <w:r>
+        <w:rPr>
+          <w:rFonts w:ascii="Aptos" w:hAnsi="Aptos"/>
+        </w:rPr>
+        <w:br w:type="page"/>
+      </w:r>
+    </w:p>
+    <w:p>
+      <w:pPr>
+        <w:pStyle w:val="Heading2"/>
+      </w:pPr>
+      <w:bookmarkStart w:id="23" w:name="_Toc232598536"/>
+      <w:r>
+        <w:lastRenderedPageBreak/>
+        <w:t>Content Research and Sourcing</w:t>
+      </w:r>
+      <w:bookmarkEnd w:id="23"/>
+    </w:p>
+    <w:p>
+      <w:pPr>
+        <w:rPr>
+          <w:rFonts w:ascii="Aptos" w:hAnsi="Aptos"/>
+          <w:lang w:val="en-US"/>
+        </w:rPr>
+      </w:pPr>
+      <w:r>
+        <w:rPr>
+          <w:rFonts w:ascii="Aptos" w:hAnsi="Aptos"/>
+          <w:lang w:val="en-US"/>
+        </w:rPr>
+        <w:t>Thorough research was conducted on Charles Greenway to identify the content required for each webpage. The information collected focuses on the business's services, company background, contact details, and customer engagement requirements.</w:t>
+      </w:r>
+    </w:p>
+    <w:p>
+      <w:pPr>
+        <w:pStyle w:val="Heading3"/>
+        <w:rPr>
+          <w:lang w:val="en-US"/>
+        </w:rPr>
+      </w:pPr>
+      <w:bookmarkStart w:id="24" w:name="_Toc232598537"/>
+      <w:r>
+        <w:rPr>
+          <w:lang w:val="en-US"/>
+        </w:rPr>
+        <w:t>Organization’s</w:t>
+      </w:r>
+      <w:r>
+        <w:rPr>
+          <w:lang w:val="en-US"/>
+        </w:rPr>
+        <w:t xml:space="preserve"> Existing Information</w:t>
+      </w:r>
+      <w:bookmarkEnd w:id="24"/>
+    </w:p>
+    <w:p>
+      <w:pPr>
+        <w:rPr>
+          <w:rFonts w:ascii="Aptos" w:hAnsi="Aptos"/>
+          <w:lang w:val="en-US"/>
+        </w:rPr>
+      </w:pPr>
+      <w:r>
+        <w:rPr>
+          <w:rFonts w:ascii="Aptos" w:hAnsi="Aptos"/>
+          <w:lang w:val="en-US"/>
+        </w:rPr>
+        <w:t>The primary source of information is the Charles Greenway business plan and information provided by the business owner. This content will be used to create the company overview, service descriptions, pricing information, business goals, mission statement, and contact details.</w:t>
+      </w:r>
+    </w:p>
+    <w:p>
+      <w:pPr>
+        <w:pStyle w:val="Heading3"/>
+        <w:rPr>
+          <w:lang w:val="en-US"/>
+        </w:rPr>
+      </w:pPr>
+      <w:bookmarkStart w:id="25" w:name="_Toc232598538"/>
+      <w:r>
+        <w:rPr>
+          <w:lang w:val="en-US"/>
+        </w:rPr>
+        <w:t>Social Media Sources</w:t>
+      </w:r>
+      <w:bookmarkEnd w:id="25"/>
+    </w:p>
+    <w:p>
+      <w:pPr>
+        <w:rPr>
+          <w:rFonts w:ascii="Aptos" w:hAnsi="Aptos"/>
+          <w:lang w:val="en-US"/>
+        </w:rPr>
+      </w:pPr>
+      <w:r>
+        <w:rPr>
+          <w:rFonts w:ascii="Aptos" w:hAnsi="Aptos"/>
+          <w:lang w:val="en-US"/>
+        </w:rPr>
+        <w:t>The business's social media platforms, including Facebook, Instagram, and WhatsApp Business, will be used to gather additional content such as service photographs, customer interactions, testimonials, promotional content, and business updates. Social media links will also be included on the Contact page to improve customer engagement.</w:t>
+      </w:r>
+    </w:p>
+    <w:p>
+      <w:pPr>
+        <w:pStyle w:val="Heading3"/>
+        <w:rPr>
+          <w:lang w:val="en-US"/>
+        </w:rPr>
+      </w:pPr>
+      <w:bookmarkStart w:id="26" w:name="_Toc232598539"/>
+      <w:r>
+        <w:rPr>
+          <w:lang w:val="en-US"/>
+        </w:rPr>
+        <w:t>Public Domain and Creative Commons Resources</w:t>
+      </w:r>
+      <w:bookmarkEnd w:id="26"/>
+    </w:p>
+    <w:p>
+      <w:pPr>
+        <w:rPr>
+          <w:rFonts w:ascii="Aptos" w:hAnsi="Aptos"/>
+          <w:lang w:val="en-US"/>
+        </w:rPr>
+      </w:pPr>
+      <w:r>
+        <w:rPr>
+          <w:rFonts w:ascii="Aptos" w:hAnsi="Aptos"/>
+          <w:lang w:val="en-US"/>
+        </w:rPr>
+        <w:t>Free-to-use resources will be obtained from reputable websites such as Unsplash, Pexels, Pixabay, Font Awesome, and Google Fonts. These resources will provide high-quality gardening images, icons, and typography that support the website's professional appearance while complying with copyright requirements.</w:t>
+      </w:r>
+    </w:p>
+    <w:p>
+      <w:pPr>
+        <w:pStyle w:val="Heading3"/>
+        <w:rPr>
+          <w:lang w:val="en-US"/>
+        </w:rPr>
+      </w:pPr>
+      <w:bookmarkStart w:id="27" w:name="_Toc232598540"/>
+      <w:r>
+        <w:rPr>
+          <w:lang w:val="en-US"/>
+        </w:rPr>
+        <w:t>Original Content Creation</w:t>
+      </w:r>
+      <w:bookmarkEnd w:id="27"/>
+    </w:p>
+    <w:p>
+      <w:pPr>
+        <w:rPr>
+          <w:rFonts w:ascii="Aptos" w:hAnsi="Aptos"/>
+          <w:lang w:val="en-US"/>
+        </w:rPr>
+      </w:pPr>
+      <w:r>
+        <w:rPr>
+          <w:rFonts w:ascii="Aptos" w:hAnsi="Aptos"/>
+          <w:lang w:val="en-US"/>
+        </w:rPr>
+        <w:t>Original content will be created specifically for the website. This includes:</w:t>
+      </w:r>
+    </w:p>
+    <w:p>
+      <w:pPr>
+        <w:numPr>
+          <w:ilvl w:val="0"/>
+          <w:numId w:val="23"/>
+        </w:numPr>
+        <w:rPr>
+          <w:rFonts w:ascii="Aptos" w:hAnsi="Aptos"/>
+          <w:lang w:val="en-US"/>
+        </w:rPr>
+      </w:pPr>
+      <w:r>
+        <w:rPr>
+          <w:rFonts w:ascii="Aptos" w:hAnsi="Aptos"/>
+          <w:lang w:val="en-US"/>
+        </w:rPr>
+        <w:t>Service descriptions for lawn mowing, hedge trimming, weed removal, pest control, and garden maintenance.</w:t>
+      </w:r>
+    </w:p>
+    <w:p>
+      <w:pPr>
+        <w:numPr>
+          <w:ilvl w:val="0"/>
+          <w:numId w:val="23"/>
+        </w:numPr>
+        <w:rPr>
+          <w:rFonts w:ascii="Aptos" w:hAnsi="Aptos"/>
+          <w:lang w:val="en-US"/>
+        </w:rPr>
+      </w:pPr>
+      <w:r>
+        <w:rPr>
+          <w:rFonts w:ascii="Aptos" w:hAnsi="Aptos"/>
+          <w:lang w:val="en-US"/>
+        </w:rPr>
+        <w:t>Company introduction and business history.</w:t>
+      </w:r>
+    </w:p>
+    <w:p>
+      <w:pPr>
+        <w:numPr>
+          <w:ilvl w:val="0"/>
+          <w:numId w:val="23"/>
+        </w:numPr>
+        <w:rPr>
+          <w:rFonts w:ascii="Aptos" w:hAnsi="Aptos"/>
+          <w:lang w:val="en-US"/>
+        </w:rPr>
+      </w:pPr>
+      <w:r>
+        <w:rPr>
+          <w:rFonts w:ascii="Aptos" w:hAnsi="Aptos"/>
+          <w:lang w:val="en-US"/>
+        </w:rPr>
+        <w:t>Call-to-action messages encouraging customers to request quotations.</w:t>
+      </w:r>
+    </w:p>
+    <w:p>
+      <w:pPr>
+        <w:numPr>
+          <w:ilvl w:val="0"/>
+          <w:numId w:val="23"/>
+        </w:numPr>
+        <w:rPr>
+          <w:rFonts w:ascii="Aptos" w:hAnsi="Aptos"/>
+          <w:lang w:val="en-US"/>
+        </w:rPr>
+      </w:pPr>
+      <w:r>
+        <w:rPr>
+          <w:rFonts w:ascii="Aptos" w:hAnsi="Aptos"/>
+          <w:lang w:val="en-US"/>
+        </w:rPr>
+        <w:t>Frequently Asked Questions (FAQ) content.</w:t>
+      </w:r>
+    </w:p>
+    <w:p>
+      <w:pPr>
+        <w:numPr>
+          <w:ilvl w:val="0"/>
+          <w:numId w:val="23"/>
+        </w:numPr>
+        <w:rPr>
+          <w:rFonts w:ascii="Aptos" w:hAnsi="Aptos"/>
+          <w:lang w:val="en-US"/>
+        </w:rPr>
+      </w:pPr>
+      <w:r>
+        <w:rPr>
+          <w:rFonts w:ascii="Aptos" w:hAnsi="Aptos"/>
+          <w:lang w:val="en-US"/>
+        </w:rPr>
+        <w:t>Contact and enquiry page instructions.</w:t>
+      </w:r>
+    </w:p>
+    <w:p>
+      <w:pPr>
+        <w:numPr>
+          <w:ilvl w:val="0"/>
+          <w:numId w:val="23"/>
+        </w:numPr>
+        <w:rPr>
+          <w:rFonts w:ascii="Aptos" w:hAnsi="Aptos"/>
+          <w:lang w:val="en-US"/>
+        </w:rPr>
+      </w:pPr>
+      <w:r>
+        <w:rPr>
+          <w:rFonts w:ascii="Aptos" w:hAnsi="Aptos"/>
+          <w:lang w:val="en-US"/>
+        </w:rPr>
+        <w:t>Pricing tables and package descriptions.</w:t>
+      </w:r>
+    </w:p>
+    <w:p>
+      <w:pPr>
+        <w:pStyle w:val="Heading3"/>
+        <w:rPr>
+          <w:lang w:val="en-US"/>
+        </w:rPr>
+      </w:pPr>
+      <w:bookmarkStart w:id="28" w:name="_Toc232598541"/>
+      <w:r>
+        <w:rPr>
+          <w:lang w:val="en-US"/>
+        </w:rPr>
+        <w:t>Content Allocation by Page</w:t>
+      </w:r>
+      <w:bookmarkEnd w:id="28"/>
+    </w:p>
+    <w:p>
+      <w:pPr>
+        <w:numPr>
+          <w:ilvl w:val="0"/>
+          <w:numId w:val="24"/>
+        </w:numPr>
+        <w:rPr>
+          <w:rFonts w:ascii="Aptos" w:hAnsi="Aptos"/>
+          <w:lang w:val="en-US"/>
+        </w:rPr>
+      </w:pPr>
+      <w:r>
+        <w:rPr>
+          <w:rFonts w:ascii="Aptos" w:hAnsi="Aptos"/>
+          <w:b/>
+          <w:bCs/>
+          <w:lang w:val="en-US"/>
+        </w:rPr>
+        <w:t>Homepage:</w:t>
+      </w:r>
+      <w:r>
+        <w:rPr>
+          <w:rFonts w:ascii="Aptos" w:hAnsi="Aptos"/>
+          <w:lang w:val="en-US"/>
+        </w:rPr>
+        <w:t xml:space="preserve"> Company introduction, service highlights, hero image, and call-to-action content.</w:t>
+      </w:r>
+    </w:p>
+    <w:p>
+      <w:pPr>
+        <w:numPr>
+          <w:ilvl w:val="0"/>
+          <w:numId w:val="24"/>
+        </w:numPr>
+        <w:rPr>
+          <w:rFonts w:ascii="Aptos" w:hAnsi="Aptos"/>
+          <w:lang w:val="en-US"/>
+        </w:rPr>
+      </w:pPr>
+      <w:r>
+        <w:rPr>
+          <w:rFonts w:ascii="Aptos" w:hAnsi="Aptos"/>
+          <w:b/>
+          <w:bCs/>
+          <w:lang w:val="en-US"/>
+        </w:rPr>
+        <w:t>About Page:</w:t>
+      </w:r>
+      <w:r>
+        <w:rPr>
+          <w:rFonts w:ascii="Aptos" w:hAnsi="Aptos"/>
+          <w:lang w:val="en-US"/>
+        </w:rPr>
+        <w:t xml:space="preserve"> Business history, mission, values, and team information.</w:t>
+      </w:r>
+    </w:p>
+    <w:p>
+      <w:pPr>
+        <w:numPr>
+          <w:ilvl w:val="0"/>
+          <w:numId w:val="24"/>
+        </w:numPr>
+        <w:rPr>
+          <w:rFonts w:ascii="Aptos" w:hAnsi="Aptos"/>
+          <w:lang w:val="en-US"/>
+        </w:rPr>
+      </w:pPr>
+      <w:r>
+        <w:rPr>
+          <w:rFonts w:ascii="Aptos" w:hAnsi="Aptos"/>
+          <w:b/>
+          <w:bCs/>
+          <w:lang w:val="en-US"/>
+        </w:rPr>
+        <w:t>Services Page:</w:t>
+      </w:r>
+      <w:r>
+        <w:rPr>
+          <w:rFonts w:ascii="Aptos" w:hAnsi="Aptos"/>
+          <w:lang w:val="en-US"/>
+        </w:rPr>
+        <w:t xml:space="preserve"> Detailed service descriptions, pricing information, and FAQs.</w:t>
+      </w:r>
+    </w:p>
+    <w:p>
+      <w:pPr>
+        <w:numPr>
+          <w:ilvl w:val="0"/>
+          <w:numId w:val="24"/>
+        </w:numPr>
+        <w:rPr>
+          <w:rFonts w:ascii="Aptos" w:hAnsi="Aptos"/>
+          <w:lang w:val="en-US"/>
+        </w:rPr>
+      </w:pPr>
+      <w:r>
+        <w:rPr>
+          <w:rFonts w:ascii="Aptos" w:hAnsi="Aptos"/>
+          <w:b/>
+          <w:bCs/>
+          <w:lang w:val="en-US"/>
+        </w:rPr>
+        <w:t>Enquiry Page:</w:t>
+      </w:r>
+      <w:r>
+        <w:rPr>
+          <w:rFonts w:ascii="Aptos" w:hAnsi="Aptos"/>
+          <w:lang w:val="en-US"/>
+        </w:rPr>
+        <w:t xml:space="preserve"> Enquiry form content, instructions, and service selection options.</w:t>
+      </w:r>
+    </w:p>
+    <w:p>
+      <w:pPr>
+        <w:numPr>
+          <w:ilvl w:val="0"/>
+          <w:numId w:val="24"/>
+        </w:numPr>
+        <w:rPr>
+          <w:rFonts w:ascii="Aptos" w:hAnsi="Aptos"/>
+          <w:lang w:val="en-US"/>
+        </w:rPr>
+      </w:pPr>
+      <w:r>
+        <w:rPr>
+          <w:rFonts w:ascii="Aptos" w:hAnsi="Aptos"/>
+          <w:b/>
+          <w:bCs/>
+          <w:lang w:val="en-US"/>
+        </w:rPr>
+        <w:lastRenderedPageBreak/>
+        <w:t>Contact Page:</w:t>
+      </w:r>
+      <w:r>
+        <w:rPr>
+          <w:rFonts w:ascii="Aptos" w:hAnsi="Aptos"/>
+          <w:lang w:val="en-US"/>
+        </w:rPr>
+        <w:t xml:space="preserve"> Contact details, operating hours, social media links, and service area information.</w:t>
+      </w:r>
+    </w:p>
+    <w:p>
+      <w:pPr>
+        <w:rPr>
+          <w:rFonts w:ascii="Aptos" w:hAnsi="Aptos"/>
+          <w:lang w:val="en-US"/>
+        </w:rPr>
+      </w:pPr>
+      <w:r>
+        <w:rPr>
+          <w:rFonts w:ascii="Aptos" w:hAnsi="Aptos"/>
+          <w:lang w:val="en-US"/>
+        </w:rPr>
+        <w:t>All content will be reviewed for accuracy, relevance, readability, and consistency with the Charles Greenway brand before being published on the website.</w:t>
+      </w:r>
+    </w:p>
+    <w:p>
+      <w:pPr>
+        <w:pStyle w:val="Heading3"/>
+        <w:rPr>
+          <w:lang w:val="en-US"/>
+        </w:rPr>
+      </w:pPr>
+      <w:bookmarkStart w:id="29" w:name="_Toc232598542"/>
+      <w:r>
+        <w:rPr>
+          <w:lang w:val="en-US"/>
+        </w:rPr>
+        <w:t>Images used throughout the project and website</w:t>
+      </w:r>
+      <w:bookmarkEnd w:id="29"/>
+    </w:p>
+    <w:p>
+      <w:pPr>
+        <w:rPr>
+          <w:lang w:val="en-US"/>
+        </w:rPr>
+      </w:pPr>
+    </w:p>
+    <w:p>
+      <w:pPr>
+        <w:rPr>
+          <w:b/>
+          <w:bCs/>
+          <w:u w:val="single"/>
+          <w:lang w:val="en-US"/>
+        </w:rPr>
+      </w:pPr>
+      <w:r>
+        <w:rPr>
+          <w:b/>
+          <w:bCs/>
+          <w:u w:val="single"/>
+          <w:lang w:val="en-US"/>
+        </w:rPr>
+        <w:t>LOGO</w:t>
+      </w:r>
+    </w:p>
+    <w:p>
+      <w:pPr>
+        <w:rPr>
+          <w:rFonts w:ascii="Aptos" w:hAnsi="Aptos"/>
+        </w:rPr>
+      </w:pPr>
+      <w:r>
+        <w:rPr>
+          <w:noProof/>
+        </w:rPr>
+        <w:drawing>
+          <wp:inline distT="0" distB="0" distL="0" distR="0" wp14:anchorId="05632122" wp14:editId="622940A0">
+            <wp:extent cx="2256282" cy="1371600"/>
+            <wp:effectExtent l="0" t="0" r="0" b="0"/>
+            <wp:docPr id="2041530010" name="Picture 1"/>
+            <wp:cNvGraphicFramePr>
+              <a:graphicFrameLocks xmlns:a="http://schemas.openxmlformats.org/drawingml/2006/main" noChangeAspect="1"/>
+            </wp:cNvGraphicFramePr>
+            <a:graphic xmlns:a="http://schemas.openxmlformats.org/drawingml/2006/main">
+              <a:graphicData uri="http://schemas.openxmlformats.org/drawingml/2006/picture">
+                <pic:pic xmlns:pic="http://schemas.openxmlformats.org/drawingml/2006/picture">
+                  <pic:nvPicPr>
+                    <pic:cNvPr id="0" name="Picture 1"/>
+                    <pic:cNvPicPr>
+                      <a:picLocks noChangeAspect="1" noChangeArrowheads="1"/>
+                    </pic:cNvPicPr>
+                  </pic:nvPicPr>
+                  <pic:blipFill>
+                    <a:blip r:embed="rId18" cstate="print">
+                      <a:extLst>
+                        <a:ext uri="{28A0092B-C50C-407E-A947-70E740481C1C}">
+                          <a14:useLocalDpi xmlns:a14="http://schemas.microsoft.com/office/drawing/2010/main" val="0"/>
+                        </a:ext>
+                      </a:extLst>
+                    </a:blip>
+                    <a:srcRect/>
+                    <a:stretch>
+                      <a:fillRect/>
+                    </a:stretch>
+                  </pic:blipFill>
+                  <pic:spPr bwMode="auto">
+                    <a:xfrm>
+                      <a:off x="0" y="0"/>
+                      <a:ext cx="2262207" cy="1375202"/>
+                    </a:xfrm>
+                    <a:prstGeom prst="rect">
+                      <a:avLst/>
+                    </a:prstGeom>
+                    <a:noFill/>
+                    <a:ln>
+                      <a:noFill/>
+                    </a:ln>
+                  </pic:spPr>
+                </pic:pic>
+              </a:graphicData>
+            </a:graphic>
+          </wp:inline>
+        </w:drawing>
+      </w:r>
+    </w:p>
+    <w:p>
+      <w:pPr>
+        <w:rPr>
+          <w:rFonts w:ascii="Aptos" w:hAnsi="Aptos"/>
+        </w:rPr>
+      </w:pPr>
+    </w:p>
+    <w:p>
+      <w:pPr>
+        <w:rPr>
+          <w:rFonts w:ascii="Aptos" w:hAnsi="Aptos"/>
+          <w:b/>
+          <w:bCs/>
+          <w:u w:val="single"/>
+        </w:rPr>
+      </w:pPr>
+      <w:r>
+        <w:rPr>
+          <w:rFonts w:ascii="Aptos" w:hAnsi="Aptos"/>
+          <w:b/>
+          <w:bCs/>
+          <w:u w:val="single"/>
+        </w:rPr>
+        <w:t xml:space="preserve">HERO </w:t>
+      </w:r>
+      <w:r>
+        <w:rPr>
+          <w:rFonts w:ascii="Aptos" w:hAnsi="Aptos"/>
+          <w:b/>
+          <w:bCs/>
+          <w:u w:val="single"/>
+        </w:rPr>
+        <w:t>PICK</w:t>
+      </w:r>
+    </w:p>
+    <w:p>
+      <w:pPr>
+        <w:rPr>
+          <w:rFonts w:ascii="Aptos" w:hAnsi="Aptos"/>
+          <w:b/>
+          <w:bCs/>
+        </w:rPr>
+      </w:pPr>
+      <w:r>
+        <w:rPr>
+          <w:noProof/>
+        </w:rPr>
+        <w:drawing>
+          <wp:inline distT="0" distB="0" distL="0" distR="0" wp14:anchorId="7F11F80B" wp14:editId="5977A843">
+            <wp:extent cx="2775122" cy="1571625"/>
+            <wp:effectExtent l="0" t="0" r="6350" b="0"/>
+            <wp:docPr id="1238333944" name="Picture 3"/>
+            <wp:cNvGraphicFramePr>
+              <a:graphicFrameLocks xmlns:a="http://schemas.openxmlformats.org/drawingml/2006/main" noChangeAspect="1"/>
+            </wp:cNvGraphicFramePr>
+            <a:graphic xmlns:a="http://schemas.openxmlformats.org/drawingml/2006/main">
+              <a:graphicData uri="http://schemas.openxmlformats.org/drawingml/2006/picture">
+                <pic:pic xmlns:pic="http://schemas.openxmlformats.org/drawingml/2006/picture">
+                  <pic:nvPicPr>
+                    <pic:cNvPr id="0" name="Picture 8"/>
+                    <pic:cNvPicPr>
+                      <a:picLocks noChangeAspect="1" noChangeArrowheads="1"/>
+                    </pic:cNvPicPr>
+                  </pic:nvPicPr>
+                  <pic:blipFill>
+                    <a:blip r:embed="rId19">
+                      <a:extLst>
+                        <a:ext uri="{28A0092B-C50C-407E-A947-70E740481C1C}">
+                          <a14:useLocalDpi xmlns:a14="http://schemas.microsoft.com/office/drawing/2010/main" val="0"/>
+                        </a:ext>
+                      </a:extLst>
+                    </a:blip>
+                    <a:srcRect/>
+                    <a:stretch>
+                      <a:fillRect/>
+                    </a:stretch>
+                  </pic:blipFill>
+                  <pic:spPr bwMode="auto">
+                    <a:xfrm>
+                      <a:off x="0" y="0"/>
+                      <a:ext cx="2779873" cy="1574316"/>
+                    </a:xfrm>
+                    <a:prstGeom prst="rect">
+                      <a:avLst/>
+                    </a:prstGeom>
+                    <a:noFill/>
+                    <a:ln>
+                      <a:noFill/>
+                    </a:ln>
+                  </pic:spPr>
+                </pic:pic>
+              </a:graphicData>
+            </a:graphic>
+          </wp:inline>
+        </w:drawing>
+      </w:r>
+      <w:r>
+        <w:rPr>
+          <w:rFonts w:ascii="Aptos" w:hAnsi="Aptos"/>
+          <w:b/>
+          <w:bCs/>
+        </w:rPr>
+        <w:br w:type="page"/>
+      </w:r>
+    </w:p>
+    <w:p>
+      <w:pPr>
+        <w:rPr>
+          <w:rFonts w:ascii="Aptos" w:hAnsi="Aptos"/>
+        </w:rPr>
+      </w:pPr>
+    </w:p>
+    <w:p>
+      <w:pPr>
+        <w:rPr>
+          <w:rFonts w:ascii="Aptos" w:hAnsi="Aptos"/>
           <w:u w:val="words"/>
         </w:rPr>
       </w:pPr>
@@ -8216,15 +9338,14 @@
       <w:pPr>
         <w:pStyle w:val="Heading1"/>
       </w:pPr>
-      <w:bookmarkStart w:id="23" w:name="_Toc230943019"/>
-      <w:r>
-        <w:lastRenderedPageBreak/>
+      <w:bookmarkStart w:id="30" w:name="_Toc232598543"/>
+      <w:r>
         <w:t>Sitemap:</w:t>
       </w:r>
       <w:r>
         <w:t xml:space="preserve"> Websites Basic Structure</w:t>
       </w:r>
-      <w:bookmarkEnd w:id="23"/>
+      <w:bookmarkEnd w:id="30"/>
     </w:p>
     <w:p>
       <w:pPr>
@@ -8245,7 +9366,7 @@
             <wp:cNvGraphicFramePr/>
             <a:graphic xmlns:a="http://schemas.openxmlformats.org/drawingml/2006/main">
               <a:graphicData uri="http://schemas.openxmlformats.org/drawingml/2006/diagram">
-                <dgm:relIds xmlns:dgm="http://schemas.openxmlformats.org/drawingml/2006/diagram" xmlns:r="http://schemas.openxmlformats.org/officeDocument/2006/relationships" r:dm="rId18" r:lo="rId19" r:qs="rId20" r:cs="rId21"/>
+                <dgm:relIds xmlns:dgm="http://schemas.openxmlformats.org/drawingml/2006/diagram" xmlns:r="http://schemas.openxmlformats.org/officeDocument/2006/relationships" r:dm="rId20" r:lo="rId21" r:qs="rId22" r:cs="rId23"/>
               </a:graphicData>
             </a:graphic>
           </wp:inline>
@@ -8517,6 +9638,155 @@
     </w:lvl>
   </w:abstractNum>
   <w:abstractNum w:abstractNumId="1" w15:restartNumberingAfterBreak="0">
+    <w:nsid w:val="081302AA"/>
+    <w:multiLevelType w:val="multilevel"/>
+    <w:tmpl w:val="DA5C886C"/>
+    <w:lvl w:ilvl="0">
+      <w:start w:val="1"/>
+      <w:numFmt w:val="bullet"/>
+      <w:lvlText w:val=""/>
+      <w:lvlJc w:val="left"/>
+      <w:pPr>
+        <w:tabs>
+          <w:tab w:val="num" w:pos="720"/>
+        </w:tabs>
+        <w:ind w:left="720" w:hanging="360"/>
+      </w:pPr>
+      <w:rPr>
+        <w:rFonts w:ascii="Symbol" w:hAnsi="Symbol" w:hint="default"/>
+        <w:sz w:val="20"/>
+      </w:rPr>
+    </w:lvl>
+    <w:lvl w:ilvl="1" w:tentative="1">
+      <w:start w:val="1"/>
+      <w:numFmt w:val="bullet"/>
+      <w:lvlText w:val="o"/>
+      <w:lvlJc w:val="left"/>
+      <w:pPr>
+        <w:tabs>
+          <w:tab w:val="num" w:pos="1440"/>
+        </w:tabs>
+        <w:ind w:left="1440" w:hanging="360"/>
+      </w:pPr>
+      <w:rPr>
+        <w:rFonts w:ascii="Courier New" w:hAnsi="Courier New" w:hint="default"/>
+        <w:sz w:val="20"/>
+      </w:rPr>
+    </w:lvl>
+    <w:lvl w:ilvl="2" w:tentative="1">
+      <w:start w:val="1"/>
+      <w:numFmt w:val="bullet"/>
+      <w:lvlText w:val=""/>
+      <w:lvlJc w:val="left"/>
+      <w:pPr>
+        <w:tabs>
+          <w:tab w:val="num" w:pos="2160"/>
+        </w:tabs>
+        <w:ind w:left="2160" w:hanging="360"/>
+      </w:pPr>
+      <w:rPr>
+        <w:rFonts w:ascii="Wingdings" w:hAnsi="Wingdings" w:hint="default"/>
+        <w:sz w:val="20"/>
+      </w:rPr>
+    </w:lvl>
+    <w:lvl w:ilvl="3" w:tentative="1">
+      <w:start w:val="1"/>
+      <w:numFmt w:val="bullet"/>
+      <w:lvlText w:val=""/>
+      <w:lvlJc w:val="left"/>
+      <w:pPr>
+        <w:tabs>
+          <w:tab w:val="num" w:pos="2880"/>
+        </w:tabs>
+        <w:ind w:left="2880" w:hanging="360"/>
+      </w:pPr>
+      <w:rPr>
+        <w:rFonts w:ascii="Wingdings" w:hAnsi="Wingdings" w:hint="default"/>
+        <w:sz w:val="20"/>
+      </w:rPr>
+    </w:lvl>
+    <w:lvl w:ilvl="4" w:tentative="1">
+      <w:start w:val="1"/>
+      <w:numFmt w:val="bullet"/>
+      <w:lvlText w:val=""/>
+      <w:lvlJc w:val="left"/>
+      <w:pPr>
+        <w:tabs>
+          <w:tab w:val="num" w:pos="3600"/>
+        </w:tabs>
+        <w:ind w:left="3600" w:hanging="360"/>
+      </w:pPr>
+      <w:rPr>
+        <w:rFonts w:ascii="Wingdings" w:hAnsi="Wingdings" w:hint="default"/>
+        <w:sz w:val="20"/>
+      </w:rPr>
+    </w:lvl>
+    <w:lvl w:ilvl="5" w:tentative="1">
+      <w:start w:val="1"/>
+      <w:numFmt w:val="bullet"/>
+      <w:lvlText w:val=""/>
+      <w:lvlJc w:val="left"/>
+      <w:pPr>
+        <w:tabs>
+          <w:tab w:val="num" w:pos="4320"/>
+        </w:tabs>
+        <w:ind w:left="4320" w:hanging="360"/>
+      </w:pPr>
+      <w:rPr>
+        <w:rFonts w:ascii="Wingdings" w:hAnsi="Wingdings" w:hint="default"/>
+        <w:sz w:val="20"/>
+      </w:rPr>
+    </w:lvl>
+    <w:lvl w:ilvl="6" w:tentative="1">
+      <w:start w:val="1"/>
+      <w:numFmt w:val="bullet"/>
+      <w:lvlText w:val=""/>
+      <w:lvlJc w:val="left"/>
+      <w:pPr>
+        <w:tabs>
+          <w:tab w:val="num" w:pos="5040"/>
+        </w:tabs>
+        <w:ind w:left="5040" w:hanging="360"/>
+      </w:pPr>
+      <w:rPr>
+        <w:rFonts w:ascii="Wingdings" w:hAnsi="Wingdings" w:hint="default"/>
+        <w:sz w:val="20"/>
+      </w:rPr>
+    </w:lvl>
+    <w:lvl w:ilvl="7" w:tentative="1">
+      <w:start w:val="1"/>
+      <w:numFmt w:val="bullet"/>
+      <w:lvlText w:val=""/>
+      <w:lvlJc w:val="left"/>
+      <w:pPr>
+        <w:tabs>
+          <w:tab w:val="num" w:pos="5760"/>
+        </w:tabs>
+        <w:ind w:left="5760" w:hanging="360"/>
+      </w:pPr>
+      <w:rPr>
+        <w:rFonts w:ascii="Wingdings" w:hAnsi="Wingdings" w:hint="default"/>
+        <w:sz w:val="20"/>
+      </w:rPr>
+    </w:lvl>
+    <w:lvl w:ilvl="8" w:tentative="1">
+      <w:start w:val="1"/>
+      <w:numFmt w:val="bullet"/>
+      <w:lvlText w:val=""/>
+      <w:lvlJc w:val="left"/>
+      <w:pPr>
+        <w:tabs>
+          <w:tab w:val="num" w:pos="6480"/>
+        </w:tabs>
+        <w:ind w:left="6480" w:hanging="360"/>
+      </w:pPr>
+      <w:rPr>
+        <w:rFonts w:ascii="Wingdings" w:hAnsi="Wingdings" w:hint="default"/>
+        <w:sz w:val="20"/>
+      </w:rPr>
+    </w:lvl>
+  </w:abstractNum>
+  <w:abstractNum w:abstractNumId="2" w15:restartNumberingAfterBreak="0">
     <w:nsid w:val="0A0F2417"/>
     <w:multiLevelType w:val="hybridMultilevel"/>
     <w:tmpl w:val="C39A6B58"/>
@@ -8605,7 +9875,7 @@
       </w:pPr>
     </w:lvl>
   </w:abstractNum>
-  <w:abstractNum w:abstractNumId="2" w15:restartNumberingAfterBreak="0">
+  <w:abstractNum w:abstractNumId="3" w15:restartNumberingAfterBreak="0">
     <w:nsid w:val="194C3C8E"/>
     <w:multiLevelType w:val="multilevel"/>
     <w:tmpl w:val="81A8B13C"/>
@@ -8754,7 +10024,7 @@
       </w:rPr>
     </w:lvl>
   </w:abstractNum>
-  <w:abstractNum w:abstractNumId="3" w15:restartNumberingAfterBreak="0">
+  <w:abstractNum w:abstractNumId="4" w15:restartNumberingAfterBreak="0">
     <w:nsid w:val="1BD14D62"/>
     <w:multiLevelType w:val="hybridMultilevel"/>
     <w:tmpl w:val="C7CEACC8"/>
@@ -8867,7 +10137,7 @@
       </w:rPr>
     </w:lvl>
   </w:abstractNum>
-  <w:abstractNum w:abstractNumId="4" w15:restartNumberingAfterBreak="0">
+  <w:abstractNum w:abstractNumId="5" w15:restartNumberingAfterBreak="0">
     <w:nsid w:val="1CD542DB"/>
     <w:multiLevelType w:val="hybridMultilevel"/>
     <w:tmpl w:val="02C21D4A"/>
@@ -8980,7 +10250,7 @@
       </w:rPr>
     </w:lvl>
   </w:abstractNum>
-  <w:abstractNum w:abstractNumId="5" w15:restartNumberingAfterBreak="0">
+  <w:abstractNum w:abstractNumId="6" w15:restartNumberingAfterBreak="0">
     <w:nsid w:val="21C23C24"/>
     <w:multiLevelType w:val="hybridMultilevel"/>
     <w:tmpl w:val="E0047B2C"/>
@@ -9093,7 +10363,156 @@
       </w:rPr>
     </w:lvl>
   </w:abstractNum>
-  <w:abstractNum w:abstractNumId="6" w15:restartNumberingAfterBreak="0">
+  <w:abstractNum w:abstractNumId="7" w15:restartNumberingAfterBreak="0">
+    <w:nsid w:val="26210C1C"/>
+    <w:multiLevelType w:val="multilevel"/>
+    <w:tmpl w:val="7EC6D142"/>
+    <w:lvl w:ilvl="0">
+      <w:start w:val="1"/>
+      <w:numFmt w:val="bullet"/>
+      <w:lvlText w:val=""/>
+      <w:lvlJc w:val="left"/>
+      <w:pPr>
+        <w:tabs>
+          <w:tab w:val="num" w:pos="720"/>
+        </w:tabs>
+        <w:ind w:left="720" w:hanging="360"/>
+      </w:pPr>
+      <w:rPr>
+        <w:rFonts w:ascii="Symbol" w:hAnsi="Symbol" w:hint="default"/>
+        <w:sz w:val="20"/>
+      </w:rPr>
+    </w:lvl>
+    <w:lvl w:ilvl="1" w:tentative="1">
+      <w:start w:val="1"/>
+      <w:numFmt w:val="bullet"/>
+      <w:lvlText w:val="o"/>
+      <w:lvlJc w:val="left"/>
+      <w:pPr>
+        <w:tabs>
+          <w:tab w:val="num" w:pos="1440"/>
+        </w:tabs>
+        <w:ind w:left="1440" w:hanging="360"/>
+      </w:pPr>
+      <w:rPr>
+        <w:rFonts w:ascii="Courier New" w:hAnsi="Courier New" w:hint="default"/>
+        <w:sz w:val="20"/>
+      </w:rPr>
+    </w:lvl>
+    <w:lvl w:ilvl="2" w:tentative="1">
+      <w:start w:val="1"/>
+      <w:numFmt w:val="bullet"/>
+      <w:lvlText w:val=""/>
+      <w:lvlJc w:val="left"/>
+      <w:pPr>
+        <w:tabs>
+          <w:tab w:val="num" w:pos="2160"/>
+        </w:tabs>
+        <w:ind w:left="2160" w:hanging="360"/>
+      </w:pPr>
+      <w:rPr>
+        <w:rFonts w:ascii="Wingdings" w:hAnsi="Wingdings" w:hint="default"/>
+        <w:sz w:val="20"/>
+      </w:rPr>
+    </w:lvl>
+    <w:lvl w:ilvl="3" w:tentative="1">
+      <w:start w:val="1"/>
+      <w:numFmt w:val="bullet"/>
+      <w:lvlText w:val=""/>
+      <w:lvlJc w:val="left"/>
+      <w:pPr>
+        <w:tabs>
+          <w:tab w:val="num" w:pos="2880"/>
+        </w:tabs>
+        <w:ind w:left="2880" w:hanging="360"/>
+      </w:pPr>
+      <w:rPr>
+        <w:rFonts w:ascii="Wingdings" w:hAnsi="Wingdings" w:hint="default"/>
+        <w:sz w:val="20"/>
+      </w:rPr>
+    </w:lvl>
+    <w:lvl w:ilvl="4" w:tentative="1">
+      <w:start w:val="1"/>
+      <w:numFmt w:val="bullet"/>
+      <w:lvlText w:val=""/>
+      <w:lvlJc w:val="left"/>
+      <w:pPr>
+        <w:tabs>
+          <w:tab w:val="num" w:pos="3600"/>
+        </w:tabs>
+        <w:ind w:left="3600" w:hanging="360"/>
+      </w:pPr>
+      <w:rPr>
+        <w:rFonts w:ascii="Wingdings" w:hAnsi="Wingdings" w:hint="default"/>
+        <w:sz w:val="20"/>
+      </w:rPr>
+    </w:lvl>
+    <w:lvl w:ilvl="5" w:tentative="1">
+      <w:start w:val="1"/>
+      <w:numFmt w:val="bullet"/>
+      <w:lvlText w:val=""/>
+      <w:lvlJc w:val="left"/>
+      <w:pPr>
+        <w:tabs>
+          <w:tab w:val="num" w:pos="4320"/>
+        </w:tabs>
+        <w:ind w:left="4320" w:hanging="360"/>
+      </w:pPr>
+      <w:rPr>
+        <w:rFonts w:ascii="Wingdings" w:hAnsi="Wingdings" w:hint="default"/>
+        <w:sz w:val="20"/>
+      </w:rPr>
+    </w:lvl>
+    <w:lvl w:ilvl="6" w:tentative="1">
+      <w:start w:val="1"/>
+      <w:numFmt w:val="bullet"/>
+      <w:lvlText w:val=""/>
+      <w:lvlJc w:val="left"/>
+      <w:pPr>
+        <w:tabs>
+          <w:tab w:val="num" w:pos="5040"/>
+        </w:tabs>
+        <w:ind w:left="5040" w:hanging="360"/>
+      </w:pPr>
+      <w:rPr>
+        <w:rFonts w:ascii="Wingdings" w:hAnsi="Wingdings" w:hint="default"/>
+        <w:sz w:val="20"/>
+      </w:rPr>
+    </w:lvl>
+    <w:lvl w:ilvl="7" w:tentative="1">
+      <w:start w:val="1"/>
+      <w:numFmt w:val="bullet"/>
+      <w:lvlText w:val=""/>
+      <w:lvlJc w:val="left"/>
+      <w:pPr>
+        <w:tabs>
+          <w:tab w:val="num" w:pos="5760"/>
+        </w:tabs>
+        <w:ind w:left="5760" w:hanging="360"/>
+      </w:pPr>
+      <w:rPr>
+        <w:rFonts w:ascii="Wingdings" w:hAnsi="Wingdings" w:hint="default"/>
+        <w:sz w:val="20"/>
+      </w:rPr>
+    </w:lvl>
+    <w:lvl w:ilvl="8" w:tentative="1">
+      <w:start w:val="1"/>
+      <w:numFmt w:val="bullet"/>
+      <w:lvlText w:val=""/>
+      <w:lvlJc w:val="left"/>
+      <w:pPr>
+        <w:tabs>
+          <w:tab w:val="num" w:pos="6480"/>
+        </w:tabs>
+        <w:ind w:left="6480" w:hanging="360"/>
+      </w:pPr>
+      <w:rPr>
+        <w:rFonts w:ascii="Wingdings" w:hAnsi="Wingdings" w:hint="default"/>
+        <w:sz w:val="20"/>
+      </w:rPr>
+    </w:lvl>
+  </w:abstractNum>
+  <w:abstractNum w:abstractNumId="8" w15:restartNumberingAfterBreak="0">
     <w:nsid w:val="38391866"/>
     <w:multiLevelType w:val="hybridMultilevel"/>
     <w:tmpl w:val="726CF6DC"/>
@@ -9206,7 +10625,7 @@
       </w:rPr>
     </w:lvl>
   </w:abstractNum>
-  <w:abstractNum w:abstractNumId="7" w15:restartNumberingAfterBreak="0">
+  <w:abstractNum w:abstractNumId="9" w15:restartNumberingAfterBreak="0">
     <w:nsid w:val="3DE83C15"/>
     <w:multiLevelType w:val="hybridMultilevel"/>
     <w:tmpl w:val="1354C786"/>
@@ -9295,7 +10714,7 @@
       </w:pPr>
     </w:lvl>
   </w:abstractNum>
-  <w:abstractNum w:abstractNumId="8" w15:restartNumberingAfterBreak="0">
+  <w:abstractNum w:abstractNumId="10" w15:restartNumberingAfterBreak="0">
     <w:nsid w:val="43763E58"/>
     <w:multiLevelType w:val="hybridMultilevel"/>
     <w:tmpl w:val="F000FAA4"/>
@@ -9408,7 +10827,7 @@
       </w:rPr>
     </w:lvl>
   </w:abstractNum>
-  <w:abstractNum w:abstractNumId="9" w15:restartNumberingAfterBreak="0">
+  <w:abstractNum w:abstractNumId="11" w15:restartNumberingAfterBreak="0">
     <w:nsid w:val="48D25F29"/>
     <w:multiLevelType w:val="hybridMultilevel"/>
     <w:tmpl w:val="D50EF970"/>
@@ -9521,7 +10940,7 @@
       </w:rPr>
     </w:lvl>
   </w:abstractNum>
-  <w:abstractNum w:abstractNumId="10" w15:restartNumberingAfterBreak="0">
+  <w:abstractNum w:abstractNumId="12" w15:restartNumberingAfterBreak="0">
     <w:nsid w:val="4DE87E86"/>
     <w:multiLevelType w:val="hybridMultilevel"/>
     <w:tmpl w:val="65D2C36E"/>
@@ -9634,7 +11053,7 @@
       </w:rPr>
     </w:lvl>
   </w:abstractNum>
-  <w:abstractNum w:abstractNumId="11" w15:restartNumberingAfterBreak="0">
+  <w:abstractNum w:abstractNumId="13" w15:restartNumberingAfterBreak="0">
     <w:nsid w:val="558637DE"/>
     <w:multiLevelType w:val="hybridMultilevel"/>
     <w:tmpl w:val="D8141D6A"/>
@@ -9747,7 +11166,7 @@
       </w:rPr>
     </w:lvl>
   </w:abstractNum>
-  <w:abstractNum w:abstractNumId="12" w15:restartNumberingAfterBreak="0">
+  <w:abstractNum w:abstractNumId="14" w15:restartNumberingAfterBreak="0">
     <w:nsid w:val="59845D9B"/>
     <w:multiLevelType w:val="multilevel"/>
     <w:tmpl w:val="923804FE"/>
@@ -9896,7 +11315,7 @@
       </w:rPr>
     </w:lvl>
   </w:abstractNum>
-  <w:abstractNum w:abstractNumId="13" w15:restartNumberingAfterBreak="0">
+  <w:abstractNum w:abstractNumId="15" w15:restartNumberingAfterBreak="0">
     <w:nsid w:val="6C276523"/>
     <w:multiLevelType w:val="multilevel"/>
     <w:tmpl w:val="82B025E0"/>
@@ -10045,7 +11464,7 @@
       </w:rPr>
     </w:lvl>
   </w:abstractNum>
-  <w:abstractNum w:abstractNumId="14" w15:restartNumberingAfterBreak="0">
+  <w:abstractNum w:abstractNumId="16" w15:restartNumberingAfterBreak="0">
     <w:nsid w:val="72795292"/>
     <w:multiLevelType w:val="multilevel"/>
     <w:tmpl w:val="DDCA4650"/>
@@ -10194,7 +11613,7 @@
       </w:rPr>
     </w:lvl>
   </w:abstractNum>
-  <w:abstractNum w:abstractNumId="15" w15:restartNumberingAfterBreak="0">
+  <w:abstractNum w:abstractNumId="17" w15:restartNumberingAfterBreak="0">
     <w:nsid w:val="72BD0F41"/>
     <w:multiLevelType w:val="hybridMultilevel"/>
     <w:tmpl w:val="C50CFF68"/>
@@ -10307,7 +11726,7 @@
       </w:rPr>
     </w:lvl>
   </w:abstractNum>
-  <w:abstractNum w:abstractNumId="16" w15:restartNumberingAfterBreak="0">
+  <w:abstractNum w:abstractNumId="18" w15:restartNumberingAfterBreak="0">
     <w:nsid w:val="72F02786"/>
     <w:multiLevelType w:val="hybridMultilevel"/>
     <w:tmpl w:val="EF4264AA"/>
@@ -10420,7 +11839,7 @@
       </w:rPr>
     </w:lvl>
   </w:abstractNum>
-  <w:abstractNum w:abstractNumId="17" w15:restartNumberingAfterBreak="0">
+  <w:abstractNum w:abstractNumId="19" w15:restartNumberingAfterBreak="0">
     <w:nsid w:val="73D632D9"/>
     <w:multiLevelType w:val="multilevel"/>
     <w:tmpl w:val="E7CAAFDC"/>
@@ -10569,7 +11988,7 @@
       </w:rPr>
     </w:lvl>
   </w:abstractNum>
-  <w:abstractNum w:abstractNumId="18" w15:restartNumberingAfterBreak="0">
+  <w:abstractNum w:abstractNumId="20" w15:restartNumberingAfterBreak="0">
     <w:nsid w:val="793658A5"/>
     <w:multiLevelType w:val="hybridMultilevel"/>
     <w:tmpl w:val="F7342E0E"/>
@@ -10682,7 +12101,7 @@
       </w:rPr>
     </w:lvl>
   </w:abstractNum>
-  <w:abstractNum w:abstractNumId="19" w15:restartNumberingAfterBreak="0">
+  <w:abstractNum w:abstractNumId="21" w15:restartNumberingAfterBreak="0">
     <w:nsid w:val="79F755BC"/>
     <w:multiLevelType w:val="hybridMultilevel"/>
     <w:tmpl w:val="B9C65D8A"/>
@@ -10795,7 +12214,7 @@
       </w:rPr>
     </w:lvl>
   </w:abstractNum>
-  <w:abstractNum w:abstractNumId="20" w15:restartNumberingAfterBreak="0">
+  <w:abstractNum w:abstractNumId="22" w15:restartNumberingAfterBreak="0">
     <w:nsid w:val="7D2B1D49"/>
     <w:multiLevelType w:val="hybridMultilevel"/>
     <w:tmpl w:val="6C440EF6"/>
@@ -10908,7 +12327,7 @@
       </w:rPr>
     </w:lvl>
   </w:abstractNum>
-  <w:abstractNum w:abstractNumId="21" w15:restartNumberingAfterBreak="0">
+  <w:abstractNum w:abstractNumId="23" w15:restartNumberingAfterBreak="0">
     <w:nsid w:val="7EA429FE"/>
     <w:multiLevelType w:val="hybridMultilevel"/>
     <w:tmpl w:val="80C44F2A"/>
@@ -11022,70 +12441,76 @@
     </w:lvl>
   </w:abstractNum>
   <w:num w:numId="1" w16cid:durableId="356736766">
-    <w:abstractNumId w:val="7"/>
+    <w:abstractNumId w:val="9"/>
   </w:num>
   <w:num w:numId="2" w16cid:durableId="1570071607">
-    <w:abstractNumId w:val="1"/>
+    <w:abstractNumId w:val="2"/>
   </w:num>
   <w:num w:numId="3" w16cid:durableId="993922042">
-    <w:abstractNumId w:val="3"/>
+    <w:abstractNumId w:val="4"/>
   </w:num>
   <w:num w:numId="4" w16cid:durableId="1527912004">
-    <w:abstractNumId w:val="15"/>
+    <w:abstractNumId w:val="17"/>
   </w:num>
   <w:num w:numId="5" w16cid:durableId="139419865">
+    <w:abstractNumId w:val="8"/>
+  </w:num>
+  <w:num w:numId="6" w16cid:durableId="1302925656">
     <w:abstractNumId w:val="6"/>
   </w:num>
-  <w:num w:numId="6" w16cid:durableId="1302925656">
-    <w:abstractNumId w:val="5"/>
-  </w:num>
   <w:num w:numId="7" w16cid:durableId="1702051593">
-    <w:abstractNumId w:val="16"/>
+    <w:abstractNumId w:val="18"/>
   </w:num>
   <w:num w:numId="8" w16cid:durableId="1270697775">
-    <w:abstractNumId w:val="21"/>
+    <w:abstractNumId w:val="23"/>
   </w:num>
   <w:num w:numId="9" w16cid:durableId="1747529448">
-    <w:abstractNumId w:val="9"/>
+    <w:abstractNumId w:val="11"/>
   </w:num>
   <w:num w:numId="10" w16cid:durableId="1080447934">
     <w:abstractNumId w:val="0"/>
   </w:num>
   <w:num w:numId="11" w16cid:durableId="2061007032">
+    <w:abstractNumId w:val="14"/>
+  </w:num>
+  <w:num w:numId="12" w16cid:durableId="522325575">
+    <w:abstractNumId w:val="19"/>
+  </w:num>
+  <w:num w:numId="13" w16cid:durableId="1165779591">
+    <w:abstractNumId w:val="15"/>
+  </w:num>
+  <w:num w:numId="14" w16cid:durableId="1955332905">
+    <w:abstractNumId w:val="3"/>
+  </w:num>
+  <w:num w:numId="15" w16cid:durableId="1799297252">
+    <w:abstractNumId w:val="16"/>
+  </w:num>
+  <w:num w:numId="16" w16cid:durableId="819931148">
+    <w:abstractNumId w:val="22"/>
+  </w:num>
+  <w:num w:numId="17" w16cid:durableId="933592896">
+    <w:abstractNumId w:val="5"/>
+  </w:num>
+  <w:num w:numId="18" w16cid:durableId="2066103286">
+    <w:abstractNumId w:val="21"/>
+  </w:num>
+  <w:num w:numId="19" w16cid:durableId="1004550390">
+    <w:abstractNumId w:val="20"/>
+  </w:num>
+  <w:num w:numId="20" w16cid:durableId="674184671">
+    <w:abstractNumId w:val="13"/>
+  </w:num>
+  <w:num w:numId="21" w16cid:durableId="49421155">
     <w:abstractNumId w:val="12"/>
   </w:num>
-  <w:num w:numId="12" w16cid:durableId="522325575">
-    <w:abstractNumId w:val="17"/>
-  </w:num>
-  <w:num w:numId="13" w16cid:durableId="1165779591">
-    <w:abstractNumId w:val="13"/>
-  </w:num>
-  <w:num w:numId="14" w16cid:durableId="1955332905">
-    <w:abstractNumId w:val="2"/>
-  </w:num>
-  <w:num w:numId="15" w16cid:durableId="1799297252">
-    <w:abstractNumId w:val="14"/>
-  </w:num>
-  <w:num w:numId="16" w16cid:durableId="819931148">
-    <w:abstractNumId w:val="20"/>
-  </w:num>
-  <w:num w:numId="17" w16cid:durableId="933592896">
-    <w:abstractNumId w:val="4"/>
-  </w:num>
-  <w:num w:numId="18" w16cid:durableId="2066103286">
-    <w:abstractNumId w:val="19"/>
-  </w:num>
-  <w:num w:numId="19" w16cid:durableId="1004550390">
-    <w:abstractNumId w:val="18"/>
-  </w:num>
-  <w:num w:numId="20" w16cid:durableId="674184671">
-    <w:abstractNumId w:val="11"/>
-  </w:num>
-  <w:num w:numId="21" w16cid:durableId="49421155">
+  <w:num w:numId="22" w16cid:durableId="34163257">
     <w:abstractNumId w:val="10"/>
   </w:num>
-  <w:num w:numId="22" w16cid:durableId="34163257">
-    <w:abstractNumId w:val="8"/>
+  <w:num w:numId="23" w16cid:durableId="327561509">
+    <w:abstractNumId w:val="1"/>
+  </w:num>
+  <w:num w:numId="24" w16cid:durableId="952591026">
+    <w:abstractNumId w:val="7"/>
   </w:num>
 </w:numbering>
 </file>
@@ -14391,7 +15816,7 @@
   <dgm:whole/>
   <dgm:extLst>
     <a:ext uri="http://schemas.microsoft.com/office/drawing/2008/diagram">
-      <dsp:dataModelExt xmlns:dsp="http://schemas.microsoft.com/office/drawing/2008/diagram" relId="rId22" minVer="http://schemas.openxmlformats.org/drawingml/2006/diagram"/>
+      <dsp:dataModelExt xmlns:dsp="http://schemas.microsoft.com/office/drawing/2008/diagram" relId="rId24" minVer="http://schemas.openxmlformats.org/drawingml/2006/diagram"/>
     </a:ext>
   </dgm:extLst>
 </dgm:dataModel>

</xml_diff>